<commit_message>
removing separate regulatory notification section
</commit_message>
<xml_diff>
--- a/templates/investigation-report-template.docx
+++ b/templates/investigation-report-template.docx
@@ -354,102 +354,102 @@
                 <w:sz w:val="24"/>
                 <w:szCs w:val="24"/>
               </w:rPr>
-              <w:t xml:space="preserve">• Clearly define what happens actually.</w:t>
-            </w:r>
-          </w:p>
-          <w:p>
-            <w:pPr>
-              <w:spacing w:before="60" w:line="276" w:lineRule="auto"/>
-              <w:jc w:val="both"/>
-              <w:rPr>
-                <w:bCs/>
-                <w:sz w:val="24"/>
-                <w:szCs w:val="24"/>
-              </w:rPr>
-            </w:pPr>
-            <w:r>
-              <w:rPr>
-                <w:bCs/>
-                <w:sz w:val="24"/>
-                <w:szCs w:val="24"/>
-              </w:rPr>
-              <w:t xml:space="preserve">• Explain what is different than expected.</w:t>
-            </w:r>
-          </w:p>
-          <w:p>
-            <w:pPr>
-              <w:spacing w:before="60" w:line="276" w:lineRule="auto"/>
-              <w:jc w:val="both"/>
-              <w:rPr>
-                <w:bCs/>
-                <w:sz w:val="24"/>
-                <w:szCs w:val="24"/>
-              </w:rPr>
-            </w:pPr>
-            <w:r>
-              <w:rPr>
-                <w:bCs/>
-                <w:sz w:val="24"/>
-                <w:szCs w:val="24"/>
-              </w:rPr>
-              <w:t xml:space="preserve">• Mention the location where the deviation has occurred.</w:t>
-            </w:r>
-          </w:p>
-          <w:p>
-            <w:pPr>
-              <w:spacing w:before="60" w:line="276" w:lineRule="auto"/>
-              <w:jc w:val="both"/>
-              <w:rPr>
-                <w:bCs/>
-                <w:sz w:val="24"/>
-                <w:szCs w:val="24"/>
-              </w:rPr>
-            </w:pPr>
-            <w:r>
-              <w:rPr>
-                <w:bCs/>
-                <w:sz w:val="24"/>
-                <w:szCs w:val="24"/>
-              </w:rPr>
-              <w:t xml:space="preserve">• Date/time of deviation occurrence and date/time of detection.</w:t>
-            </w:r>
-          </w:p>
-          <w:p>
-            <w:pPr>
-              <w:spacing w:before="60" w:line="276" w:lineRule="auto"/>
-              <w:jc w:val="both"/>
-              <w:rPr>
-                <w:bCs/>
-                <w:sz w:val="24"/>
-                <w:szCs w:val="24"/>
-              </w:rPr>
-            </w:pPr>
-            <w:r>
-              <w:rPr>
-                <w:bCs/>
-                <w:sz w:val="24"/>
-                <w:szCs w:val="24"/>
-              </w:rPr>
-              <w:t xml:space="preserve">• Mention the name of personnel who is involved in the deviation.</w:t>
-            </w:r>
-          </w:p>
-          <w:p>
-            <w:pPr>
-              <w:spacing w:before="60" w:line="276" w:lineRule="auto"/>
-              <w:jc w:val="both"/>
-              <w:rPr>
-                <w:bCs/>
-                <w:sz w:val="24"/>
-                <w:szCs w:val="24"/>
-              </w:rPr>
-            </w:pPr>
-            <w:r>
-              <w:rPr>
-                <w:bCs/>
-                <w:sz w:val="24"/>
-                <w:szCs w:val="24"/>
-              </w:rPr>
-              <w:t xml:space="preserve">• Mention initial scope of deviation (impacted product/Material/Equipment/System/Batches/etc.)</w:t>
+              <w:t xml:space="preserve">1. Clearly define what happens actually.</w:t>
+            </w:r>
+          </w:p>
+          <w:p>
+            <w:pPr>
+              <w:spacing w:before="60" w:line="276" w:lineRule="auto"/>
+              <w:jc w:val="both"/>
+              <w:rPr>
+                <w:bCs/>
+                <w:sz w:val="24"/>
+                <w:szCs w:val="24"/>
+              </w:rPr>
+            </w:pPr>
+            <w:r>
+              <w:rPr>
+                <w:bCs/>
+                <w:sz w:val="24"/>
+                <w:szCs w:val="24"/>
+              </w:rPr>
+              <w:t xml:space="preserve">2. Explain what is different than expected.</w:t>
+            </w:r>
+          </w:p>
+          <w:p>
+            <w:pPr>
+              <w:spacing w:before="60" w:line="276" w:lineRule="auto"/>
+              <w:jc w:val="both"/>
+              <w:rPr>
+                <w:bCs/>
+                <w:sz w:val="24"/>
+                <w:szCs w:val="24"/>
+              </w:rPr>
+            </w:pPr>
+            <w:r>
+              <w:rPr>
+                <w:bCs/>
+                <w:sz w:val="24"/>
+                <w:szCs w:val="24"/>
+              </w:rPr>
+              <w:t xml:space="preserve">3. Mention the location where the deviation has occurred.</w:t>
+            </w:r>
+          </w:p>
+          <w:p>
+            <w:pPr>
+              <w:spacing w:before="60" w:line="276" w:lineRule="auto"/>
+              <w:jc w:val="both"/>
+              <w:rPr>
+                <w:bCs/>
+                <w:sz w:val="24"/>
+                <w:szCs w:val="24"/>
+              </w:rPr>
+            </w:pPr>
+            <w:r>
+              <w:rPr>
+                <w:bCs/>
+                <w:sz w:val="24"/>
+                <w:szCs w:val="24"/>
+              </w:rPr>
+              <w:t xml:space="preserve">4. Date/time of deviation occurrence and date/time of detection.</w:t>
+            </w:r>
+          </w:p>
+          <w:p>
+            <w:pPr>
+              <w:spacing w:before="60" w:line="276" w:lineRule="auto"/>
+              <w:jc w:val="both"/>
+              <w:rPr>
+                <w:bCs/>
+                <w:sz w:val="24"/>
+                <w:szCs w:val="24"/>
+              </w:rPr>
+            </w:pPr>
+            <w:r>
+              <w:rPr>
+                <w:bCs/>
+                <w:sz w:val="24"/>
+                <w:szCs w:val="24"/>
+              </w:rPr>
+              <w:t xml:space="preserve">5. Mention the name of personnel who is involved in the deviation.</w:t>
+            </w:r>
+          </w:p>
+          <w:p>
+            <w:pPr>
+              <w:spacing w:before="60" w:line="276" w:lineRule="auto"/>
+              <w:jc w:val="both"/>
+              <w:rPr>
+                <w:bCs/>
+                <w:sz w:val="24"/>
+                <w:szCs w:val="24"/>
+              </w:rPr>
+            </w:pPr>
+            <w:r>
+              <w:rPr>
+                <w:bCs/>
+                <w:sz w:val="24"/>
+                <w:szCs w:val="24"/>
+              </w:rPr>
+              <w:t xml:space="preserve">6. Mention initial scope of deviation (impacted product/Material/Equipment/System/Batches/etc.)</w:t>
             </w:r>
           </w:p>
           <w:p>
@@ -600,83 +600,83 @@
                 <w:sz w:val="24"/>
                 <w:szCs w:val="24"/>
               </w:rPr>
-              <w:t xml:space="preserve">• Does the summary provide relevant facts and data/information reviewed?</w:t>
-            </w:r>
-          </w:p>
-          <w:p>
-            <w:pPr>
-              <w:spacing w:before="60" w:line="276" w:lineRule="auto"/>
-              <w:jc w:val="both"/>
-              <w:rPr>
-                <w:bCs/>
-                <w:sz w:val="24"/>
-                <w:szCs w:val="24"/>
-              </w:rPr>
-            </w:pPr>
-            <w:r>
-              <w:rPr>
-                <w:bCs/>
-                <w:sz w:val="24"/>
-                <w:szCs w:val="24"/>
-              </w:rPr>
-              <w:t xml:space="preserve">• Is a summary of the analysis of the factors and data provided?</w:t>
-            </w:r>
-          </w:p>
-          <w:p>
-            <w:pPr>
-              <w:spacing w:before="60" w:line="276" w:lineRule="auto"/>
-              <w:jc w:val="both"/>
-              <w:rPr>
-                <w:bCs/>
-                <w:sz w:val="24"/>
-                <w:szCs w:val="24"/>
-              </w:rPr>
-            </w:pPr>
-            <w:r>
-              <w:rPr>
-                <w:bCs/>
-                <w:sz w:val="24"/>
-                <w:szCs w:val="24"/>
-              </w:rPr>
-              <w:t xml:space="preserve">• Is a conclusion statement of the analysis and review provided?</w:t>
-            </w:r>
-          </w:p>
-          <w:p>
-            <w:pPr>
-              <w:spacing w:before="60" w:line="276" w:lineRule="auto"/>
-              <w:jc w:val="both"/>
-              <w:rPr>
-                <w:bCs/>
-                <w:sz w:val="24"/>
-                <w:szCs w:val="24"/>
-              </w:rPr>
-            </w:pPr>
-            <w:r>
-              <w:rPr>
-                <w:bCs/>
-                <w:sz w:val="24"/>
-                <w:szCs w:val="24"/>
-              </w:rPr>
-              <w:t xml:space="preserve">• If there were Regulatory Notification, were details provided?</w:t>
-            </w:r>
-          </w:p>
-          <w:p>
-            <w:pPr>
-              <w:spacing w:before="60" w:line="276" w:lineRule="auto"/>
-              <w:jc w:val="both"/>
-              <w:rPr>
-                <w:bCs/>
-                <w:sz w:val="24"/>
-                <w:szCs w:val="24"/>
-              </w:rPr>
-            </w:pPr>
-            <w:r>
-              <w:rPr>
-                <w:bCs/>
-                <w:sz w:val="24"/>
-                <w:szCs w:val="24"/>
-              </w:rPr>
-              <w:t xml:space="preserve">• Is the report written in a logical flow and easily understood by the reader?</w:t>
+              <w:t xml:space="preserve">1. Does the summary provide relevant facts and data/information reviewed?</w:t>
+            </w:r>
+          </w:p>
+          <w:p>
+            <w:pPr>
+              <w:spacing w:before="60" w:line="276" w:lineRule="auto"/>
+              <w:jc w:val="both"/>
+              <w:rPr>
+                <w:bCs/>
+                <w:sz w:val="24"/>
+                <w:szCs w:val="24"/>
+              </w:rPr>
+            </w:pPr>
+            <w:r>
+              <w:rPr>
+                <w:bCs/>
+                <w:sz w:val="24"/>
+                <w:szCs w:val="24"/>
+              </w:rPr>
+              <w:t xml:space="preserve">2. Is a summary of the analysis of the factors and data provided?</w:t>
+            </w:r>
+          </w:p>
+          <w:p>
+            <w:pPr>
+              <w:spacing w:before="60" w:line="276" w:lineRule="auto"/>
+              <w:jc w:val="both"/>
+              <w:rPr>
+                <w:bCs/>
+                <w:sz w:val="24"/>
+                <w:szCs w:val="24"/>
+              </w:rPr>
+            </w:pPr>
+            <w:r>
+              <w:rPr>
+                <w:bCs/>
+                <w:sz w:val="24"/>
+                <w:szCs w:val="24"/>
+              </w:rPr>
+              <w:t xml:space="preserve">3. Is a conclusion statement of the analysis and review provided?</w:t>
+            </w:r>
+          </w:p>
+          <w:p>
+            <w:pPr>
+              <w:spacing w:before="60" w:line="276" w:lineRule="auto"/>
+              <w:jc w:val="both"/>
+              <w:rPr>
+                <w:bCs/>
+                <w:sz w:val="24"/>
+                <w:szCs w:val="24"/>
+              </w:rPr>
+            </w:pPr>
+            <w:r>
+              <w:rPr>
+                <w:bCs/>
+                <w:sz w:val="24"/>
+                <w:szCs w:val="24"/>
+              </w:rPr>
+              <w:t xml:space="preserve">4. If there were Regulatory Notification, were details provided?</w:t>
+            </w:r>
+          </w:p>
+          <w:p>
+            <w:pPr>
+              <w:spacing w:before="60" w:line="276" w:lineRule="auto"/>
+              <w:jc w:val="both"/>
+              <w:rPr>
+                <w:bCs/>
+                <w:sz w:val="24"/>
+                <w:szCs w:val="24"/>
+              </w:rPr>
+            </w:pPr>
+            <w:r>
+              <w:rPr>
+                <w:bCs/>
+                <w:sz w:val="24"/>
+                <w:szCs w:val="24"/>
+              </w:rPr>
+              <w:t xml:space="preserve">5. Is the report written in a logical flow and easily understood by the reader?</w:t>
             </w:r>
           </w:p>
           <w:p>
@@ -1063,64 +1063,7 @@
                 <w:sz w:val="24"/>
                 <w:szCs w:val="24"/>
               </w:rPr>
-              <w:t xml:space="preserve">{#fiveWhys}</w:t>
-            </w:r>
-          </w:p>
-          <w:p>
-            <w:pPr>
-              <w:spacing w:before="60" w:line="276" w:lineRule="auto"/>
-              <w:jc w:val="both"/>
-              <w:rPr>
-                <w:bCs/>
-                <w:sz w:val="24"/>
-                <w:szCs w:val="24"/>
-              </w:rPr>
-            </w:pPr>
-            <w:r>
-              <w:rPr>
-                <w:bCs/>
-                <w:sz w:val="24"/>
-                <w:szCs w:val="24"/>
-              </w:rPr>
-              <w:t xml:space="preserve">{index}. Why: {question}</w:t>
-            </w:r>
-          </w:p>
-          <w:p>
-            <w:pPr>
-              <w:spacing w:before="60" w:line="276" w:lineRule="auto"/>
-              <w:jc w:val="both"/>
-              <w:rPr>
-                <w:bCs/>
-                <w:sz w:val="24"/>
-                <w:szCs w:val="24"/>
-              </w:rPr>
-            </w:pPr>
-            <w:r>
-              <w:rPr>
-                <w:bCs/>
-                <w:sz w:val="24"/>
-                <w:szCs w:val="24"/>
-              </w:rPr>
-              <w:t xml:space="preserve">   Ans. {answer}</w:t>
-            </w:r>
-          </w:p>
-          <w:p>
-            <w:pPr>
-              <w:spacing w:before="60" w:line="276" w:lineRule="auto"/>
-              <w:jc w:val="both"/>
-              <w:rPr>
-                <w:bCs/>
-                <w:sz w:val="24"/>
-                <w:szCs w:val="24"/>
-              </w:rPr>
-            </w:pPr>
-            <w:r>
-              <w:rPr>
-                <w:bCs/>
-                <w:sz w:val="24"/>
-                <w:szCs w:val="24"/>
-              </w:rPr>
-              <w:t xml:space="preserve">{/fiveWhys}</w:t>
+              <w:t xml:space="preserve">{fiveWhyNarrative}</w:t>
             </w:r>
           </w:p>
           <w:p>
@@ -1740,102 +1683,102 @@
                 <w:sz w:val="24"/>
                 <w:szCs w:val="24"/>
               </w:rPr>
-              <w:t xml:space="preserve">• Were specific corrective actions identified (including immediate actions)?</w:t>
-            </w:r>
-          </w:p>
-          <w:p>
-            <w:pPr>
-              <w:spacing w:before="60" w:line="276" w:lineRule="auto"/>
-              <w:jc w:val="both"/>
-              <w:rPr>
-                <w:bCs/>
-                <w:sz w:val="24"/>
-                <w:szCs w:val="24"/>
-              </w:rPr>
-            </w:pPr>
-            <w:r>
-              <w:rPr>
-                <w:bCs/>
-                <w:sz w:val="24"/>
-                <w:szCs w:val="24"/>
-              </w:rPr>
-              <w:t xml:space="preserve">• Were specific corrective actions identified for each root cause?</w:t>
-            </w:r>
-          </w:p>
-          <w:p>
-            <w:pPr>
-              <w:spacing w:before="60" w:line="276" w:lineRule="auto"/>
-              <w:jc w:val="both"/>
-              <w:rPr>
-                <w:bCs/>
-                <w:sz w:val="24"/>
-                <w:szCs w:val="24"/>
-              </w:rPr>
-            </w:pPr>
-            <w:r>
-              <w:rPr>
-                <w:bCs/>
-                <w:sz w:val="24"/>
-                <w:szCs w:val="24"/>
-              </w:rPr>
-              <w:t xml:space="preserve">• Was the corrective action assigned a unique number, responsible person and due date?</w:t>
-            </w:r>
-          </w:p>
-          <w:p>
-            <w:pPr>
-              <w:spacing w:before="60" w:line="276" w:lineRule="auto"/>
-              <w:jc w:val="both"/>
-              <w:rPr>
-                <w:bCs/>
-                <w:sz w:val="24"/>
-                <w:szCs w:val="24"/>
-              </w:rPr>
-            </w:pPr>
-            <w:r>
-              <w:rPr>
-                <w:bCs/>
-                <w:sz w:val="24"/>
-                <w:szCs w:val="24"/>
-              </w:rPr>
-              <w:t xml:space="preserve">• Does the action describe the expected outcome that can be verified?</w:t>
-            </w:r>
-          </w:p>
-          <w:p>
-            <w:pPr>
-              <w:spacing w:before="60" w:line="276" w:lineRule="auto"/>
-              <w:jc w:val="both"/>
-              <w:rPr>
-                <w:bCs/>
-                <w:sz w:val="24"/>
-                <w:szCs w:val="24"/>
-              </w:rPr>
-            </w:pPr>
-            <w:r>
-              <w:rPr>
-                <w:bCs/>
-                <w:sz w:val="24"/>
-                <w:szCs w:val="24"/>
-              </w:rPr>
-              <w:t xml:space="preserve">• Was effectiveness verification required or not, with rationale documented?</w:t>
-            </w:r>
-          </w:p>
-          <w:p>
-            <w:pPr>
-              <w:spacing w:before="60" w:line="276" w:lineRule="auto"/>
-              <w:jc w:val="both"/>
-              <w:rPr>
-                <w:bCs/>
-                <w:sz w:val="24"/>
-                <w:szCs w:val="24"/>
-              </w:rPr>
-            </w:pPr>
-            <w:r>
-              <w:rPr>
-                <w:bCs/>
-                <w:sz w:val="24"/>
-                <w:szCs w:val="24"/>
-              </w:rPr>
-              <w:t xml:space="preserve">• Are the identified corrective actions achievable?</w:t>
+              <w:t xml:space="preserve">1. Were specific corrective actions identified (including immediate actions)?</w:t>
+            </w:r>
+          </w:p>
+          <w:p>
+            <w:pPr>
+              <w:spacing w:before="60" w:line="276" w:lineRule="auto"/>
+              <w:jc w:val="both"/>
+              <w:rPr>
+                <w:bCs/>
+                <w:sz w:val="24"/>
+                <w:szCs w:val="24"/>
+              </w:rPr>
+            </w:pPr>
+            <w:r>
+              <w:rPr>
+                <w:bCs/>
+                <w:sz w:val="24"/>
+                <w:szCs w:val="24"/>
+              </w:rPr>
+              <w:t xml:space="preserve">2. Were specific corrective actions identified for each root cause?</w:t>
+            </w:r>
+          </w:p>
+          <w:p>
+            <w:pPr>
+              <w:spacing w:before="60" w:line="276" w:lineRule="auto"/>
+              <w:jc w:val="both"/>
+              <w:rPr>
+                <w:bCs/>
+                <w:sz w:val="24"/>
+                <w:szCs w:val="24"/>
+              </w:rPr>
+            </w:pPr>
+            <w:r>
+              <w:rPr>
+                <w:bCs/>
+                <w:sz w:val="24"/>
+                <w:szCs w:val="24"/>
+              </w:rPr>
+              <w:t xml:space="preserve">3. Was the corrective action assigned a unique number, responsible person and due date?</w:t>
+            </w:r>
+          </w:p>
+          <w:p>
+            <w:pPr>
+              <w:spacing w:before="60" w:line="276" w:lineRule="auto"/>
+              <w:jc w:val="both"/>
+              <w:rPr>
+                <w:bCs/>
+                <w:sz w:val="24"/>
+                <w:szCs w:val="24"/>
+              </w:rPr>
+            </w:pPr>
+            <w:r>
+              <w:rPr>
+                <w:bCs/>
+                <w:sz w:val="24"/>
+                <w:szCs w:val="24"/>
+              </w:rPr>
+              <w:t xml:space="preserve">4. Does the action describe the expected outcome that can be verified?</w:t>
+            </w:r>
+          </w:p>
+          <w:p>
+            <w:pPr>
+              <w:spacing w:before="60" w:line="276" w:lineRule="auto"/>
+              <w:jc w:val="both"/>
+              <w:rPr>
+                <w:bCs/>
+                <w:sz w:val="24"/>
+                <w:szCs w:val="24"/>
+              </w:rPr>
+            </w:pPr>
+            <w:r>
+              <w:rPr>
+                <w:bCs/>
+                <w:sz w:val="24"/>
+                <w:szCs w:val="24"/>
+              </w:rPr>
+              <w:t xml:space="preserve">5. Was effectiveness verification required or not, with rationale documented?</w:t>
+            </w:r>
+          </w:p>
+          <w:p>
+            <w:pPr>
+              <w:spacing w:before="60" w:line="276" w:lineRule="auto"/>
+              <w:jc w:val="both"/>
+              <w:rPr>
+                <w:bCs/>
+                <w:sz w:val="24"/>
+                <w:szCs w:val="24"/>
+              </w:rPr>
+            </w:pPr>
+            <w:r>
+              <w:rPr>
+                <w:bCs/>
+                <w:sz w:val="24"/>
+                <w:szCs w:val="24"/>
+              </w:rPr>
+              <w:t xml:space="preserve">6. Are the identified corrective actions achievable?</w:t>
             </w:r>
           </w:p>
         </w:tc>
@@ -2154,140 +2097,140 @@
                 <w:sz w:val="24"/>
                 <w:szCs w:val="24"/>
               </w:rPr>
-              <w:t xml:space="preserve">• Are specific preventive actions identified to prevent recurrence?</w:t>
-            </w:r>
-          </w:p>
-          <w:p>
-            <w:pPr>
-              <w:spacing w:before="60" w:line="276" w:lineRule="auto"/>
-              <w:jc w:val="both"/>
-              <w:rPr>
-                <w:bCs/>
-                <w:sz w:val="24"/>
-                <w:szCs w:val="24"/>
-              </w:rPr>
-            </w:pPr>
-            <w:r>
-              <w:rPr>
-                <w:bCs/>
-                <w:sz w:val="24"/>
-                <w:szCs w:val="24"/>
-              </w:rPr>
-              <w:t xml:space="preserve">• Was the preventive action assigned a unique number, responsible person and due date?</w:t>
-            </w:r>
-          </w:p>
-          <w:p>
-            <w:pPr>
-              <w:spacing w:before="60" w:line="276" w:lineRule="auto"/>
-              <w:jc w:val="both"/>
-              <w:rPr>
-                <w:bCs/>
-                <w:sz w:val="24"/>
-                <w:szCs w:val="24"/>
-              </w:rPr>
-            </w:pPr>
-            <w:r>
-              <w:rPr>
-                <w:bCs/>
-                <w:sz w:val="24"/>
-                <w:szCs w:val="24"/>
-              </w:rPr>
-              <w:t xml:space="preserve">• Does the action describe the expected outcome that can be verified?</w:t>
-            </w:r>
-          </w:p>
-          <w:p>
-            <w:pPr>
-              <w:spacing w:before="60" w:line="276" w:lineRule="auto"/>
-              <w:jc w:val="both"/>
-              <w:rPr>
-                <w:bCs/>
-                <w:sz w:val="24"/>
-                <w:szCs w:val="24"/>
-              </w:rPr>
-            </w:pPr>
-            <w:r>
-              <w:rPr>
-                <w:bCs/>
-                <w:sz w:val="24"/>
-                <w:szCs w:val="24"/>
-              </w:rPr>
-              <w:t xml:space="preserve">• Was effectiveness verification required or not, with rationale documented?</w:t>
-            </w:r>
-          </w:p>
-          <w:p>
-            <w:pPr>
-              <w:spacing w:before="60" w:line="276" w:lineRule="auto"/>
-              <w:jc w:val="both"/>
-              <w:rPr>
-                <w:bCs/>
-                <w:sz w:val="24"/>
-                <w:szCs w:val="24"/>
-              </w:rPr>
-            </w:pPr>
-            <w:r>
-              <w:rPr>
-                <w:bCs/>
-                <w:sz w:val="24"/>
-                <w:szCs w:val="24"/>
-              </w:rPr>
-              <w:t xml:space="preserve">• Was interim plan discussed for pending status of CAPA?</w:t>
-            </w:r>
-          </w:p>
-          <w:p>
-            <w:pPr>
-              <w:spacing w:before="60" w:line="276" w:lineRule="auto"/>
-              <w:jc w:val="both"/>
-              <w:rPr>
-                <w:bCs/>
-                <w:sz w:val="24"/>
-                <w:szCs w:val="24"/>
-              </w:rPr>
-            </w:pPr>
-            <w:r>
-              <w:rPr>
-                <w:bCs/>
-                <w:sz w:val="24"/>
-                <w:szCs w:val="24"/>
-              </w:rPr>
-              <w:t xml:space="preserve">• Was each impact assessment field completed correctly?</w:t>
-            </w:r>
-          </w:p>
-          <w:p>
-            <w:pPr>
-              <w:spacing w:before="60" w:line="276" w:lineRule="auto"/>
-              <w:jc w:val="both"/>
-              <w:rPr>
-                <w:bCs/>
-                <w:sz w:val="24"/>
-                <w:szCs w:val="24"/>
-              </w:rPr>
-            </w:pPr>
-            <w:r>
-              <w:rPr>
-                <w:bCs/>
-                <w:sz w:val="24"/>
-                <w:szCs w:val="24"/>
-              </w:rPr>
-              <w:t xml:space="preserve">• Does the Conclusion include final decision and rationale?</w:t>
-            </w:r>
-          </w:p>
-          <w:p>
-            <w:pPr>
-              <w:spacing w:before="60" w:line="276" w:lineRule="auto"/>
-              <w:jc w:val="both"/>
-              <w:rPr>
-                <w:bCs/>
-                <w:sz w:val="24"/>
-                <w:szCs w:val="24"/>
-              </w:rPr>
-            </w:pPr>
-            <w:r>
-              <w:rPr>
-                <w:bCs/>
-                <w:sz w:val="24"/>
-                <w:szCs w:val="24"/>
-              </w:rPr>
-              <w:t xml:space="preserve">• Are the identified preventive actions achievable?</w:t>
+              <w:t xml:space="preserve">1. Are specific preventive actions identified to prevent recurrence?</w:t>
+            </w:r>
+          </w:p>
+          <w:p>
+            <w:pPr>
+              <w:spacing w:before="60" w:line="276" w:lineRule="auto"/>
+              <w:jc w:val="both"/>
+              <w:rPr>
+                <w:bCs/>
+                <w:sz w:val="24"/>
+                <w:szCs w:val="24"/>
+              </w:rPr>
+            </w:pPr>
+            <w:r>
+              <w:rPr>
+                <w:bCs/>
+                <w:sz w:val="24"/>
+                <w:szCs w:val="24"/>
+              </w:rPr>
+              <w:t xml:space="preserve">2. Was the preventive action assigned a unique number, responsible person and due date?</w:t>
+            </w:r>
+          </w:p>
+          <w:p>
+            <w:pPr>
+              <w:spacing w:before="60" w:line="276" w:lineRule="auto"/>
+              <w:jc w:val="both"/>
+              <w:rPr>
+                <w:bCs/>
+                <w:sz w:val="24"/>
+                <w:szCs w:val="24"/>
+              </w:rPr>
+            </w:pPr>
+            <w:r>
+              <w:rPr>
+                <w:bCs/>
+                <w:sz w:val="24"/>
+                <w:szCs w:val="24"/>
+              </w:rPr>
+              <w:t xml:space="preserve">3. Does the action describe the expected outcome that can be verified?</w:t>
+            </w:r>
+          </w:p>
+          <w:p>
+            <w:pPr>
+              <w:spacing w:before="60" w:line="276" w:lineRule="auto"/>
+              <w:jc w:val="both"/>
+              <w:rPr>
+                <w:bCs/>
+                <w:sz w:val="24"/>
+                <w:szCs w:val="24"/>
+              </w:rPr>
+            </w:pPr>
+            <w:r>
+              <w:rPr>
+                <w:bCs/>
+                <w:sz w:val="24"/>
+                <w:szCs w:val="24"/>
+              </w:rPr>
+              <w:t xml:space="preserve">4. Was effectiveness verification required or not, with rationale documented?</w:t>
+            </w:r>
+          </w:p>
+          <w:p>
+            <w:pPr>
+              <w:spacing w:before="60" w:line="276" w:lineRule="auto"/>
+              <w:jc w:val="both"/>
+              <w:rPr>
+                <w:bCs/>
+                <w:sz w:val="24"/>
+                <w:szCs w:val="24"/>
+              </w:rPr>
+            </w:pPr>
+            <w:r>
+              <w:rPr>
+                <w:bCs/>
+                <w:sz w:val="24"/>
+                <w:szCs w:val="24"/>
+              </w:rPr>
+              <w:t xml:space="preserve">5. Was interim plan discussed for pending status of CAPA?</w:t>
+            </w:r>
+          </w:p>
+          <w:p>
+            <w:pPr>
+              <w:spacing w:before="60" w:line="276" w:lineRule="auto"/>
+              <w:jc w:val="both"/>
+              <w:rPr>
+                <w:bCs/>
+                <w:sz w:val="24"/>
+                <w:szCs w:val="24"/>
+              </w:rPr>
+            </w:pPr>
+            <w:r>
+              <w:rPr>
+                <w:bCs/>
+                <w:sz w:val="24"/>
+                <w:szCs w:val="24"/>
+              </w:rPr>
+              <w:t xml:space="preserve">6. Was each impact assessment field completed correctly?</w:t>
+            </w:r>
+          </w:p>
+          <w:p>
+            <w:pPr>
+              <w:spacing w:before="60" w:line="276" w:lineRule="auto"/>
+              <w:jc w:val="both"/>
+              <w:rPr>
+                <w:bCs/>
+                <w:sz w:val="24"/>
+                <w:szCs w:val="24"/>
+              </w:rPr>
+            </w:pPr>
+            <w:r>
+              <w:rPr>
+                <w:bCs/>
+                <w:sz w:val="24"/>
+                <w:szCs w:val="24"/>
+              </w:rPr>
+              <w:t xml:space="preserve">7. Does the Conclusion include final decision and rationale?</w:t>
+            </w:r>
+          </w:p>
+          <w:p>
+            <w:pPr>
+              <w:spacing w:before="60" w:line="276" w:lineRule="auto"/>
+              <w:jc w:val="both"/>
+              <w:rPr>
+                <w:bCs/>
+                <w:sz w:val="24"/>
+                <w:szCs w:val="24"/>
+              </w:rPr>
+            </w:pPr>
+            <w:r>
+              <w:rPr>
+                <w:bCs/>
+                <w:sz w:val="24"/>
+                <w:szCs w:val="24"/>
+              </w:rPr>
+              <w:t xml:space="preserve">8. Are the identified preventive actions achievable?</w:t>
             </w:r>
           </w:p>
         </w:tc>

</xml_diff>

<commit_message>
feat: preserve Word table alignment on DOCX import and export
Merge OOXML jc/vAlign into TipTap for nested layout tables, HTML table parsing,
floating table tools, and round-trip DOCX narrative XML.

Co-authored-by: Cursor <cursoragent@cursor.com>
</commit_message>
<xml_diff>
--- a/templates/investigation-report-template.docx
+++ b/templates/investigation-report-template.docx
@@ -487,7 +487,7 @@
                 <w:sz w:val="24"/>
                 <w:szCs w:val="24"/>
               </w:rPr>
-              <w:t xml:space="preserve">{defineNarrative}</w:t>
+              <w:t xml:space="preserve">{@defineNarrativeXml}</w:t>
             </w:r>
           </w:p>
         </w:tc>
@@ -714,7 +714,7 @@
                 <w:sz w:val="24"/>
                 <w:szCs w:val="24"/>
               </w:rPr>
-              <w:t xml:space="preserve">{measureNarrative}</w:t>
+              <w:t xml:space="preserve">{@measureNarrativeXml}</w:t>
             </w:r>
           </w:p>
         </w:tc>
@@ -1851,7 +1851,7 @@
                 <w:sz w:val="24"/>
                 <w:szCs w:val="24"/>
               </w:rPr>
-              <w:t xml:space="preserve">{improveNarrative}</w:t>
+              <w:t xml:space="preserve">{@improveNarrativeXml}</w:t>
             </w:r>
           </w:p>
           <w:p>
@@ -2303,7 +2303,7 @@
                 <w:sz w:val="24"/>
                 <w:szCs w:val="24"/>
               </w:rPr>
-              <w:t xml:space="preserve">{controlNarrative}</w:t>
+              <w:t xml:space="preserve">{@controlNarrativeXml}</w:t>
             </w:r>
           </w:p>
           <w:p>

</xml_diff>

<commit_message>
Align evaluation prompts with criteria-only scoring and Improve DOCX parity.
Streamline sectional Gemini prompts, send full untruncated section context, and
strip Improve/Control template preamble where it pollutes narrative. Model
corrective actions as one text field with DOCX import/export updates and legacy
row coercion. Add bulk HTML audit blocks for exact LLM requests and small
report UI fixes around placeholders and criteria sheet wiring. Narrow reports/
.gitignore so API routes remain trackable.

Co-authored-by: Cursor <cursoragent@cursor.com>
</commit_message>
<xml_diff>
--- a/templates/investigation-report-template.docx
+++ b/templates/investigation-report-template.docx
@@ -1889,140 +1889,7 @@
                 <w:sz w:val="24"/>
                 <w:szCs w:val="24"/>
               </w:rPr>
-              <w:t xml:space="preserve">Corrective Actions Register:</w:t>
-            </w:r>
-          </w:p>
-          <w:p>
-            <w:pPr>
-              <w:spacing w:before="60" w:line="276" w:lineRule="auto"/>
-              <w:jc w:val="both"/>
-              <w:rPr>
-                <w:bCs/>
-                <w:sz w:val="24"/>
-                <w:szCs w:val="24"/>
-              </w:rPr>
-            </w:pPr>
-            <w:r>
-              <w:rPr>
-                <w:bCs/>
-                <w:sz w:val="24"/>
-                <w:szCs w:val="24"/>
-              </w:rPr>
-              <w:t xml:space="preserve">{#correctiveActions}</w:t>
-            </w:r>
-          </w:p>
-          <w:p>
-            <w:pPr>
-              <w:spacing w:before="60" w:line="276" w:lineRule="auto"/>
-              <w:jc w:val="both"/>
-              <w:rPr>
-                <w:bCs/>
-                <w:sz w:val="24"/>
-                <w:szCs w:val="24"/>
-              </w:rPr>
-            </w:pPr>
-            <w:r>
-              <w:rPr>
-                <w:bCs/>
-                <w:sz w:val="24"/>
-                <w:szCs w:val="24"/>
-              </w:rPr>
-              <w:t xml:space="preserve">{caNumber}: {description}</w:t>
-            </w:r>
-          </w:p>
-          <w:p>
-            <w:pPr>
-              <w:spacing w:before="60" w:line="276" w:lineRule="auto"/>
-              <w:jc w:val="both"/>
-              <w:rPr>
-                <w:bCs/>
-                <w:sz w:val="24"/>
-                <w:szCs w:val="24"/>
-              </w:rPr>
-            </w:pPr>
-            <w:r>
-              <w:rPr>
-                <w:bCs/>
-                <w:sz w:val="24"/>
-                <w:szCs w:val="24"/>
-              </w:rPr>
-              <w:t xml:space="preserve">  Responsible person: {responsiblePerson}</w:t>
-            </w:r>
-          </w:p>
-          <w:p>
-            <w:pPr>
-              <w:spacing w:before="60" w:line="276" w:lineRule="auto"/>
-              <w:jc w:val="both"/>
-              <w:rPr>
-                <w:bCs/>
-                <w:sz w:val="24"/>
-                <w:szCs w:val="24"/>
-              </w:rPr>
-            </w:pPr>
-            <w:r>
-              <w:rPr>
-                <w:bCs/>
-                <w:sz w:val="24"/>
-                <w:szCs w:val="24"/>
-              </w:rPr>
-              <w:t xml:space="preserve">  Due date: {dueDate}</w:t>
-            </w:r>
-          </w:p>
-          <w:p>
-            <w:pPr>
-              <w:spacing w:before="60" w:line="276" w:lineRule="auto"/>
-              <w:jc w:val="both"/>
-              <w:rPr>
-                <w:bCs/>
-                <w:sz w:val="24"/>
-                <w:szCs w:val="24"/>
-              </w:rPr>
-            </w:pPr>
-            <w:r>
-              <w:rPr>
-                <w:bCs/>
-                <w:sz w:val="24"/>
-                <w:szCs w:val="24"/>
-              </w:rPr>
-              <w:t xml:space="preserve">  Expected outcome: {expectedOutcome}</w:t>
-            </w:r>
-          </w:p>
-          <w:p>
-            <w:pPr>
-              <w:spacing w:before="60" w:line="276" w:lineRule="auto"/>
-              <w:jc w:val="both"/>
-              <w:rPr>
-                <w:bCs/>
-                <w:sz w:val="24"/>
-                <w:szCs w:val="24"/>
-              </w:rPr>
-            </w:pPr>
-            <w:r>
-              <w:rPr>
-                <w:bCs/>
-                <w:sz w:val="24"/>
-                <w:szCs w:val="24"/>
-              </w:rPr>
-              <w:t xml:space="preserve">  Effectiveness verification: {effectivenessVerification}</w:t>
-            </w:r>
-          </w:p>
-          <w:p>
-            <w:pPr>
-              <w:spacing w:before="60" w:line="276" w:lineRule="auto"/>
-              <w:jc w:val="both"/>
-              <w:rPr>
-                <w:bCs/>
-                <w:sz w:val="24"/>
-                <w:szCs w:val="24"/>
-              </w:rPr>
-            </w:pPr>
-            <w:r>
-              <w:rPr>
-                <w:bCs/>
-                <w:sz w:val="24"/>
-                <w:szCs w:val="24"/>
-              </w:rPr>
-              <w:t xml:space="preserve">{/correctiveActions}</w:t>
+              <w:t xml:space="preserve">{correctiveActions}</w:t>
             </w:r>
           </w:p>
         </w:tc>

</xml_diff>

<commit_message>
Unify Improve on corrective-actions text and harden DOCX import/export.
Fold legacy narrative into corrective actions in merge, drop a separate Improve
narrative from the editor and template export, teach import to keep Improve in
one field, fall back to plain-text tools parsing when exports use Unicode
checkboxes, and add a DOCX round-trip test against the sample investigation.

Co-authored-by: Cursor <cursoragent@cursor.com>
</commit_message>
<xml_diff>
--- a/templates/investigation-report-template.docx
+++ b/templates/investigation-report-template.docx
@@ -1835,25 +1835,6 @@
               <w:right w:val="single" w:sz="4" w:space="0" w:color="auto"/>
             </w:tcBorders>
           </w:tcPr>
-          <w:p>
-            <w:pPr>
-              <w:spacing w:before="60" w:line="276" w:lineRule="auto"/>
-              <w:jc w:val="both"/>
-              <w:rPr>
-                <w:bCs/>
-                <w:sz w:val="24"/>
-                <w:szCs w:val="24"/>
-              </w:rPr>
-            </w:pPr>
-            <w:r>
-              <w:rPr>
-                <w:bCs/>
-                <w:sz w:val="24"/>
-                <w:szCs w:val="24"/>
-              </w:rPr>
-              <w:t xml:space="preserve">{improveNarrative}</w:t>
-            </w:r>
-          </w:p>
           <w:p>
             <w:pPr>
               <w:spacing w:before="60" w:line="276" w:lineRule="auto"/>

</xml_diff>

<commit_message>
feat(report): add Documents Reviewed and Attachments; unify Control for DOCX parity.
Co-authored-by: Cursor <cursoragent@cursor.com>
</commit_message>
<xml_diff>
--- a/templates/investigation-report-template.docx
+++ b/templates/investigation-report-template.docx
@@ -1851,25 +1851,6 @@
                 <w:sz w:val="24"/>
                 <w:szCs w:val="24"/>
               </w:rPr>
-              <w:t xml:space="preserve"/>
-            </w:r>
-          </w:p>
-          <w:p>
-            <w:pPr>
-              <w:spacing w:before="60" w:line="276" w:lineRule="auto"/>
-              <w:jc w:val="both"/>
-              <w:rPr>
-                <w:bCs/>
-                <w:sz w:val="24"/>
-                <w:szCs w:val="24"/>
-              </w:rPr>
-            </w:pPr>
-            <w:r>
-              <w:rPr>
-                <w:bCs/>
-                <w:sz w:val="24"/>
-                <w:szCs w:val="24"/>
-              </w:rPr>
               <w:t xml:space="preserve">{correctiveActions}</w:t>
             </w:r>
           </w:p>
@@ -2021,64 +2002,7 @@
                 <w:sz w:val="24"/>
                 <w:szCs w:val="24"/>
               </w:rPr>
-              <w:t xml:space="preserve">5. Was interim plan discussed for pending status of CAPA?</w:t>
-            </w:r>
-          </w:p>
-          <w:p>
-            <w:pPr>
-              <w:spacing w:before="60" w:line="276" w:lineRule="auto"/>
-              <w:jc w:val="both"/>
-              <w:rPr>
-                <w:bCs/>
-                <w:sz w:val="24"/>
-                <w:szCs w:val="24"/>
-              </w:rPr>
-            </w:pPr>
-            <w:r>
-              <w:rPr>
-                <w:bCs/>
-                <w:sz w:val="24"/>
-                <w:szCs w:val="24"/>
-              </w:rPr>
-              <w:t xml:space="preserve">6. Was each impact assessment field completed correctly?</w:t>
-            </w:r>
-          </w:p>
-          <w:p>
-            <w:pPr>
-              <w:spacing w:before="60" w:line="276" w:lineRule="auto"/>
-              <w:jc w:val="both"/>
-              <w:rPr>
-                <w:bCs/>
-                <w:sz w:val="24"/>
-                <w:szCs w:val="24"/>
-              </w:rPr>
-            </w:pPr>
-            <w:r>
-              <w:rPr>
-                <w:bCs/>
-                <w:sz w:val="24"/>
-                <w:szCs w:val="24"/>
-              </w:rPr>
-              <w:t xml:space="preserve">7. Does the Conclusion include final decision and rationale?</w:t>
-            </w:r>
-          </w:p>
-          <w:p>
-            <w:pPr>
-              <w:spacing w:before="60" w:line="276" w:lineRule="auto"/>
-              <w:jc w:val="both"/>
-              <w:rPr>
-                <w:bCs/>
-                <w:sz w:val="24"/>
-                <w:szCs w:val="24"/>
-              </w:rPr>
-            </w:pPr>
-            <w:r>
-              <w:rPr>
-                <w:bCs/>
-                <w:sz w:val="24"/>
-                <w:szCs w:val="24"/>
-              </w:rPr>
-              <w:t xml:space="preserve">8. Are the identified preventive actions achievable?</w:t>
+              <w:t xml:space="preserve">5. Are the identified preventive actions achievable?</w:t>
             </w:r>
           </w:p>
         </w:tc>
@@ -2151,463 +2075,7 @@
                 <w:sz w:val="24"/>
                 <w:szCs w:val="24"/>
               </w:rPr>
-              <w:t xml:space="preserve">{controlNarrative}</w:t>
-            </w:r>
-          </w:p>
-          <w:p>
-            <w:pPr>
-              <w:spacing w:before="60" w:line="276" w:lineRule="auto"/>
-              <w:jc w:val="both"/>
-              <w:rPr>
-                <w:bCs/>
-                <w:sz w:val="24"/>
-                <w:szCs w:val="24"/>
-              </w:rPr>
-            </w:pPr>
-            <w:r>
-              <w:rPr>
-                <w:bCs/>
-                <w:sz w:val="24"/>
-                <w:szCs w:val="24"/>
-              </w:rPr>
-              <w:t xml:space="preserve"/>
-            </w:r>
-          </w:p>
-          <w:p>
-            <w:pPr>
-              <w:spacing w:before="60" w:line="276" w:lineRule="auto"/>
-              <w:jc w:val="both"/>
-              <w:rPr>
-                <w:bCs/>
-                <w:sz w:val="24"/>
-                <w:szCs w:val="24"/>
-              </w:rPr>
-            </w:pPr>
-            <w:r>
-              <w:rPr>
-                <w:bCs/>
-                <w:sz w:val="24"/>
-                <w:szCs w:val="24"/>
-              </w:rPr>
-              <w:t xml:space="preserve">Preventive Actions Register:</w:t>
-            </w:r>
-          </w:p>
-          <w:p>
-            <w:pPr>
-              <w:spacing w:before="60" w:line="276" w:lineRule="auto"/>
-              <w:jc w:val="both"/>
-              <w:rPr>
-                <w:bCs/>
-                <w:sz w:val="24"/>
-                <w:szCs w:val="24"/>
-              </w:rPr>
-            </w:pPr>
-            <w:r>
-              <w:rPr>
-                <w:bCs/>
-                <w:sz w:val="24"/>
-                <w:szCs w:val="24"/>
-              </w:rPr>
-              <w:t xml:space="preserve">{#preventiveActions}</w:t>
-            </w:r>
-          </w:p>
-          <w:p>
-            <w:pPr>
-              <w:spacing w:before="60" w:line="276" w:lineRule="auto"/>
-              <w:jc w:val="both"/>
-              <w:rPr>
-                <w:bCs/>
-                <w:sz w:val="24"/>
-                <w:szCs w:val="24"/>
-              </w:rPr>
-            </w:pPr>
-            <w:r>
-              <w:rPr>
-                <w:bCs/>
-                <w:sz w:val="24"/>
-                <w:szCs w:val="24"/>
-              </w:rPr>
-              <w:t xml:space="preserve">{paNumber}: {description}</w:t>
-            </w:r>
-          </w:p>
-          <w:p>
-            <w:pPr>
-              <w:spacing w:before="60" w:line="276" w:lineRule="auto"/>
-              <w:jc w:val="both"/>
-              <w:rPr>
-                <w:bCs/>
-                <w:sz w:val="24"/>
-                <w:szCs w:val="24"/>
-              </w:rPr>
-            </w:pPr>
-            <w:r>
-              <w:rPr>
-                <w:bCs/>
-                <w:sz w:val="24"/>
-                <w:szCs w:val="24"/>
-              </w:rPr>
-              <w:t xml:space="preserve">  Linked root cause: {linkedRootCause}</w:t>
-            </w:r>
-          </w:p>
-          <w:p>
-            <w:pPr>
-              <w:spacing w:before="60" w:line="276" w:lineRule="auto"/>
-              <w:jc w:val="both"/>
-              <w:rPr>
-                <w:bCs/>
-                <w:sz w:val="24"/>
-                <w:szCs w:val="24"/>
-              </w:rPr>
-            </w:pPr>
-            <w:r>
-              <w:rPr>
-                <w:bCs/>
-                <w:sz w:val="24"/>
-                <w:szCs w:val="24"/>
-              </w:rPr>
-              <w:t xml:space="preserve">  Responsible person: {responsiblePerson}</w:t>
-            </w:r>
-          </w:p>
-          <w:p>
-            <w:pPr>
-              <w:spacing w:before="60" w:line="276" w:lineRule="auto"/>
-              <w:jc w:val="both"/>
-              <w:rPr>
-                <w:bCs/>
-                <w:sz w:val="24"/>
-                <w:szCs w:val="24"/>
-              </w:rPr>
-            </w:pPr>
-            <w:r>
-              <w:rPr>
-                <w:bCs/>
-                <w:sz w:val="24"/>
-                <w:szCs w:val="24"/>
-              </w:rPr>
-              <w:t xml:space="preserve">  Due date: {dueDate}</w:t>
-            </w:r>
-          </w:p>
-          <w:p>
-            <w:pPr>
-              <w:spacing w:before="60" w:line="276" w:lineRule="auto"/>
-              <w:jc w:val="both"/>
-              <w:rPr>
-                <w:bCs/>
-                <w:sz w:val="24"/>
-                <w:szCs w:val="24"/>
-              </w:rPr>
-            </w:pPr>
-            <w:r>
-              <w:rPr>
-                <w:bCs/>
-                <w:sz w:val="24"/>
-                <w:szCs w:val="24"/>
-              </w:rPr>
-              <w:t xml:space="preserve">  Expected outcome: {expectedOutcome}</w:t>
-            </w:r>
-          </w:p>
-          <w:p>
-            <w:pPr>
-              <w:spacing w:before="60" w:line="276" w:lineRule="auto"/>
-              <w:jc w:val="both"/>
-              <w:rPr>
-                <w:bCs/>
-                <w:sz w:val="24"/>
-                <w:szCs w:val="24"/>
-              </w:rPr>
-            </w:pPr>
-            <w:r>
-              <w:rPr>
-                <w:bCs/>
-                <w:sz w:val="24"/>
-                <w:szCs w:val="24"/>
-              </w:rPr>
-              <w:t xml:space="preserve">  Effectiveness verification: {effectivenessVerification}</w:t>
-            </w:r>
-          </w:p>
-          <w:p>
-            <w:pPr>
-              <w:spacing w:before="60" w:line="276" w:lineRule="auto"/>
-              <w:jc w:val="both"/>
-              <w:rPr>
-                <w:bCs/>
-                <w:sz w:val="24"/>
-                <w:szCs w:val="24"/>
-              </w:rPr>
-            </w:pPr>
-            <w:r>
-              <w:rPr>
-                <w:bCs/>
-                <w:sz w:val="24"/>
-                <w:szCs w:val="24"/>
-              </w:rPr>
-              <w:t xml:space="preserve">{/preventiveActions}</w:t>
-            </w:r>
-          </w:p>
-          <w:p>
-            <w:pPr>
-              <w:spacing w:before="60" w:line="276" w:lineRule="auto"/>
-              <w:jc w:val="both"/>
-              <w:rPr>
-                <w:bCs/>
-                <w:sz w:val="24"/>
-                <w:szCs w:val="24"/>
-              </w:rPr>
-            </w:pPr>
-            <w:r>
-              <w:rPr>
-                <w:bCs/>
-                <w:sz w:val="24"/>
-                <w:szCs w:val="24"/>
-              </w:rPr>
-              <w:t xml:space="preserve"/>
-            </w:r>
-          </w:p>
-          <w:p>
-            <w:pPr>
-              <w:spacing w:before="60" w:line="276" w:lineRule="auto"/>
-              <w:jc w:val="both"/>
-              <w:rPr>
-                <w:bCs/>
-                <w:sz w:val="24"/>
-                <w:szCs w:val="24"/>
-              </w:rPr>
-            </w:pPr>
-            <w:r>
-              <w:rPr>
-                <w:bCs/>
-                <w:sz w:val="24"/>
-                <w:szCs w:val="24"/>
-              </w:rPr>
-              <w:t xml:space="preserve">Interim Plan: {interimPlan}</w:t>
-            </w:r>
-          </w:p>
-          <w:p>
-            <w:pPr>
-              <w:spacing w:before="60" w:line="276" w:lineRule="auto"/>
-              <w:jc w:val="both"/>
-              <w:rPr>
-                <w:bCs/>
-                <w:sz w:val="24"/>
-                <w:szCs w:val="24"/>
-              </w:rPr>
-            </w:pPr>
-            <w:r>
-              <w:rPr>
-                <w:bCs/>
-                <w:sz w:val="24"/>
-                <w:szCs w:val="24"/>
-              </w:rPr>
-              <w:t xml:space="preserve"/>
-            </w:r>
-          </w:p>
-          <w:p>
-            <w:pPr>
-              <w:spacing w:before="60" w:line="276" w:lineRule="auto"/>
-              <w:jc w:val="both"/>
-              <w:rPr>
-                <w:bCs/>
-                <w:sz w:val="24"/>
-                <w:szCs w:val="24"/>
-              </w:rPr>
-            </w:pPr>
-            <w:r>
-              <w:rPr>
-                <w:bCs/>
-                <w:sz w:val="24"/>
-                <w:szCs w:val="24"/>
-              </w:rPr>
-              <w:t xml:space="preserve">Final Comments: {finalComments}</w:t>
-            </w:r>
-          </w:p>
-          <w:p>
-            <w:pPr>
-              <w:spacing w:before="60" w:line="276" w:lineRule="auto"/>
-              <w:jc w:val="both"/>
-              <w:rPr>
-                <w:bCs/>
-                <w:sz w:val="24"/>
-                <w:szCs w:val="24"/>
-              </w:rPr>
-            </w:pPr>
-            <w:r>
-              <w:rPr>
-                <w:bCs/>
-                <w:sz w:val="24"/>
-                <w:szCs w:val="24"/>
-              </w:rPr>
-              <w:t xml:space="preserve"/>
-            </w:r>
-          </w:p>
-          <w:p>
-            <w:pPr>
-              <w:spacing w:before="60" w:line="276" w:lineRule="auto"/>
-              <w:jc w:val="both"/>
-              <w:rPr>
-                <w:bCs/>
-                <w:sz w:val="24"/>
-                <w:szCs w:val="24"/>
-              </w:rPr>
-            </w:pPr>
-            <w:r>
-              <w:rPr>
-                <w:bCs/>
-                <w:sz w:val="24"/>
-                <w:szCs w:val="24"/>
-              </w:rPr>
-              <w:t xml:space="preserve">Impact Assessment (post-investigation):</w:t>
-            </w:r>
-          </w:p>
-          <w:p>
-            <w:pPr>
-              <w:spacing w:before="60" w:line="276" w:lineRule="auto"/>
-              <w:jc w:val="both"/>
-              <w:rPr>
-                <w:bCs/>
-                <w:sz w:val="24"/>
-                <w:szCs w:val="24"/>
-              </w:rPr>
-            </w:pPr>
-            <w:r>
-              <w:rPr>
-                <w:bCs/>
-                <w:sz w:val="24"/>
-                <w:szCs w:val="24"/>
-              </w:rPr>
-              <w:t xml:space="preserve">Regulatory Impact / Notification: {regulatoryImpact}</w:t>
-            </w:r>
-          </w:p>
-          <w:p>
-            <w:pPr>
-              <w:spacing w:before="60" w:line="276" w:lineRule="auto"/>
-              <w:jc w:val="both"/>
-              <w:rPr>
-                <w:bCs/>
-                <w:sz w:val="24"/>
-                <w:szCs w:val="24"/>
-              </w:rPr>
-            </w:pPr>
-            <w:r>
-              <w:rPr>
-                <w:bCs/>
-                <w:sz w:val="24"/>
-                <w:szCs w:val="24"/>
-              </w:rPr>
-              <w:t xml:space="preserve">Product Quality: {productQuality}</w:t>
-            </w:r>
-          </w:p>
-          <w:p>
-            <w:pPr>
-              <w:spacing w:before="60" w:line="276" w:lineRule="auto"/>
-              <w:jc w:val="both"/>
-              <w:rPr>
-                <w:bCs/>
-                <w:sz w:val="24"/>
-                <w:szCs w:val="24"/>
-              </w:rPr>
-            </w:pPr>
-            <w:r>
-              <w:rPr>
-                <w:bCs/>
-                <w:sz w:val="24"/>
-                <w:szCs w:val="24"/>
-              </w:rPr>
-              <w:t xml:space="preserve">Validation: {validation}</w:t>
-            </w:r>
-          </w:p>
-          <w:p>
-            <w:pPr>
-              <w:spacing w:before="60" w:line="276" w:lineRule="auto"/>
-              <w:jc w:val="both"/>
-              <w:rPr>
-                <w:bCs/>
-                <w:sz w:val="24"/>
-                <w:szCs w:val="24"/>
-              </w:rPr>
-            </w:pPr>
-            <w:r>
-              <w:rPr>
-                <w:bCs/>
-                <w:sz w:val="24"/>
-                <w:szCs w:val="24"/>
-              </w:rPr>
-              <w:t xml:space="preserve">Stability: {stability}</w:t>
-            </w:r>
-          </w:p>
-          <w:p>
-            <w:pPr>
-              <w:spacing w:before="60" w:line="276" w:lineRule="auto"/>
-              <w:jc w:val="both"/>
-              <w:rPr>
-                <w:bCs/>
-                <w:sz w:val="24"/>
-                <w:szCs w:val="24"/>
-              </w:rPr>
-            </w:pPr>
-            <w:r>
-              <w:rPr>
-                <w:bCs/>
-                <w:sz w:val="24"/>
-                <w:szCs w:val="24"/>
-              </w:rPr>
-              <w:t xml:space="preserve">Market / Clinical: {marketClinical}</w:t>
-            </w:r>
-          </w:p>
-          <w:p>
-            <w:pPr>
-              <w:spacing w:before="60" w:line="276" w:lineRule="auto"/>
-              <w:jc w:val="both"/>
-              <w:rPr>
-                <w:bCs/>
-                <w:sz w:val="24"/>
-                <w:szCs w:val="24"/>
-              </w:rPr>
-            </w:pPr>
-            <w:r>
-              <w:rPr>
-                <w:bCs/>
-                <w:sz w:val="24"/>
-                <w:szCs w:val="24"/>
-              </w:rPr>
-              <w:t xml:space="preserve">Lot Disposition: {lotDisposition}</w:t>
-            </w:r>
-          </w:p>
-          <w:p>
-            <w:pPr>
-              <w:spacing w:before="60" w:line="276" w:lineRule="auto"/>
-              <w:jc w:val="both"/>
-              <w:rPr>
-                <w:bCs/>
-                <w:sz w:val="24"/>
-                <w:szCs w:val="24"/>
-              </w:rPr>
-            </w:pPr>
-            <w:r>
-              <w:rPr>
-                <w:bCs/>
-                <w:sz w:val="24"/>
-                <w:szCs w:val="24"/>
-              </w:rPr>
-              <w:t xml:space="preserve"/>
-            </w:r>
-          </w:p>
-          <w:p>
-            <w:pPr>
-              <w:spacing w:before="60" w:line="276" w:lineRule="auto"/>
-              <w:jc w:val="both"/>
-              <w:rPr>
-                <w:bCs/>
-                <w:sz w:val="24"/>
-                <w:szCs w:val="24"/>
-              </w:rPr>
-            </w:pPr>
-            <w:r>
-              <w:rPr>
-                <w:bCs/>
-                <w:sz w:val="24"/>
-                <w:szCs w:val="24"/>
-              </w:rPr>
-              <w:t xml:space="preserve">Conclusion: {controlConclusion}</w:t>
+              <w:t xml:space="preserve">{preventiveActions}</w:t>
             </w:r>
           </w:p>
         </w:tc>

</xml_diff>

<commit_message>
fix(docx): simplify 5-Why placeholder and preserve table column widths
Remove the redundant Conclusion placeholder from Analyze export so the narrative
covers the full 5-Why. Read OOXML tblGrid widths at import into TipTap colWidths,
use them (or a printable fallback) when emitting tables, and set table width pct
for better page fit.

Co-authored-by: Cursor <cursoragent@cursor.com>
</commit_message>
<xml_diff>
--- a/templates/investigation-report-template.docx
+++ b/templates/investigation-report-template.docx
@@ -1083,25 +1083,6 @@
                 <w:szCs w:val="24"/>
               </w:rPr>
               <w:t xml:space="preserve"/>
-            </w:r>
-          </w:p>
-          <w:p>
-            <w:pPr>
-              <w:spacing w:before="60" w:line="276" w:lineRule="auto"/>
-              <w:jc w:val="both"/>
-              <w:rPr>
-                <w:bCs/>
-                <w:sz w:val="24"/>
-                <w:szCs w:val="24"/>
-              </w:rPr>
-            </w:pPr>
-            <w:r>
-              <w:rPr>
-                <w:bCs/>
-                <w:sz w:val="24"/>
-                <w:szCs w:val="24"/>
-              </w:rPr>
-              <w:t xml:space="preserve">Conclusion: {fiveWhyConclusion}</w:t>
             </w:r>
           </w:p>
         </w:tc>

</xml_diff>

<commit_message>
fixing minor export issues
</commit_message>
<xml_diff>
--- a/templates/investigation-report-template.docx
+++ b/templates/investigation-report-template.docx
@@ -76,7 +76,7 @@
           <w:p>
             <w:pPr>
               <w:spacing w:before="60" w:line="276" w:lineRule="auto"/>
-              <w:jc w:val="both"/>
+              <w:jc w:val="left"/>
               <w:rPr>
                 <w:bCs/>
                 <w:sz w:val="24"/>
@@ -136,7 +136,7 @@
           <w:p>
             <w:pPr>
               <w:spacing w:before="60" w:line="276" w:lineRule="auto"/>
-              <w:jc w:val="both"/>
+              <w:jc w:val="left"/>
               <w:rPr>
                 <w:bCs/>
                 <w:sz w:val="24"/>
@@ -174,20 +174,176 @@
           <w:p>
             <w:pPr>
               <w:spacing w:before="60" w:line="276" w:lineRule="auto"/>
-              <w:jc w:val="both"/>
-              <w:rPr>
-                <w:b/>
-                <w:sz w:val="24"/>
-                <w:szCs w:val="24"/>
-              </w:rPr>
-            </w:pPr>
-            <w:r>
-              <w:rPr>
-                <w:b/>
-                <w:sz w:val="24"/>
-                <w:szCs w:val="24"/>
-              </w:rPr>
-              <w:t xml:space="preserve">Investigation tool used:  {sixMCheck} 6M     {fiveWhyCheck} 5 Why     {brainstormingCheck} Brainstorming</w:t>
+              <w:jc w:val="left"/>
+              <w:rPr>
+                <w:b/>
+                <w:sz w:val="24"/>
+                <w:szCs w:val="24"/>
+              </w:rPr>
+            </w:pPr>
+            <w:r>
+              <w:rPr>
+                <w:b/>
+                <w:sz w:val="24"/>
+                <w:szCs w:val="24"/>
+              </w:rPr>
+              <w:t xml:space="preserve">Investigation tool used:  </w:t>
+            </w:r>
+            <w:r>
+              <w:rPr>
+                <w:sz w:val="24"/>
+                <w:szCs w:val="24"/>
+              </w:rPr>
+              <w:fldChar w:fldCharType="begin">
+                <w:ffData>
+                  <w:name w:val="toolSixM"/>
+                  <w:enabled/>
+                  <w:calcOnExit w:val="0"/>
+                  <w:checkBox>
+                    <w:sizeAuto/>
+                    <w:default w:val="0"/>
+                  </w:checkBox>
+                </w:ffData>
+              </w:fldChar>
+            </w:r>
+            <w:r>
+              <w:rPr>
+                <w:sz w:val="24"/>
+                <w:szCs w:val="24"/>
+              </w:rPr>
+              <w:instrText xml:space="preserve"> FORMCHECKBOX </w:instrText>
+            </w:r>
+            <w:r>
+              <w:rPr>
+                <w:sz w:val="24"/>
+                <w:szCs w:val="24"/>
+              </w:rPr>
+            </w:r>
+            <w:r>
+              <w:rPr>
+                <w:sz w:val="24"/>
+                <w:szCs w:val="24"/>
+              </w:rPr>
+              <w:fldChar w:fldCharType="separate"/>
+            </w:r>
+            <w:r>
+              <w:rPr>
+                <w:sz w:val="24"/>
+                <w:szCs w:val="24"/>
+              </w:rPr>
+              <w:fldChar w:fldCharType="end"/>
+            </w:r>
+            <w:r>
+              <w:rPr>
+                <w:b/>
+                <w:sz w:val="24"/>
+                <w:szCs w:val="24"/>
+              </w:rPr>
+              <w:t xml:space="preserve"> 6M     </w:t>
+            </w:r>
+            <w:r>
+              <w:rPr>
+                <w:sz w:val="24"/>
+                <w:szCs w:val="24"/>
+              </w:rPr>
+              <w:fldChar w:fldCharType="begin">
+                <w:ffData>
+                  <w:name w:val="toolFiveWhy"/>
+                  <w:enabled/>
+                  <w:calcOnExit w:val="0"/>
+                  <w:checkBox>
+                    <w:sizeAuto/>
+                    <w:default w:val="0"/>
+                  </w:checkBox>
+                </w:ffData>
+              </w:fldChar>
+            </w:r>
+            <w:r>
+              <w:rPr>
+                <w:sz w:val="24"/>
+                <w:szCs w:val="24"/>
+              </w:rPr>
+              <w:instrText xml:space="preserve"> FORMCHECKBOX </w:instrText>
+            </w:r>
+            <w:r>
+              <w:rPr>
+                <w:sz w:val="24"/>
+                <w:szCs w:val="24"/>
+              </w:rPr>
+            </w:r>
+            <w:r>
+              <w:rPr>
+                <w:sz w:val="24"/>
+                <w:szCs w:val="24"/>
+              </w:rPr>
+              <w:fldChar w:fldCharType="separate"/>
+            </w:r>
+            <w:r>
+              <w:rPr>
+                <w:sz w:val="24"/>
+                <w:szCs w:val="24"/>
+              </w:rPr>
+              <w:fldChar w:fldCharType="end"/>
+            </w:r>
+            <w:r>
+              <w:rPr>
+                <w:b/>
+                <w:sz w:val="24"/>
+                <w:szCs w:val="24"/>
+              </w:rPr>
+              <w:t xml:space="preserve"> 5 Why     </w:t>
+            </w:r>
+            <w:r>
+              <w:rPr>
+                <w:sz w:val="24"/>
+                <w:szCs w:val="24"/>
+              </w:rPr>
+              <w:fldChar w:fldCharType="begin">
+                <w:ffData>
+                  <w:name w:val="toolBrainstorming"/>
+                  <w:enabled/>
+                  <w:calcOnExit w:val="0"/>
+                  <w:checkBox>
+                    <w:sizeAuto/>
+                    <w:default w:val="0"/>
+                  </w:checkBox>
+                </w:ffData>
+              </w:fldChar>
+            </w:r>
+            <w:r>
+              <w:rPr>
+                <w:sz w:val="24"/>
+                <w:szCs w:val="24"/>
+              </w:rPr>
+              <w:instrText xml:space="preserve"> FORMCHECKBOX </w:instrText>
+            </w:r>
+            <w:r>
+              <w:rPr>
+                <w:sz w:val="24"/>
+                <w:szCs w:val="24"/>
+              </w:rPr>
+            </w:r>
+            <w:r>
+              <w:rPr>
+                <w:sz w:val="24"/>
+                <w:szCs w:val="24"/>
+              </w:rPr>
+              <w:fldChar w:fldCharType="separate"/>
+            </w:r>
+            <w:r>
+              <w:rPr>
+                <w:sz w:val="24"/>
+                <w:szCs w:val="24"/>
+              </w:rPr>
+              <w:fldChar w:fldCharType="end"/>
+            </w:r>
+            <w:r>
+              <w:rPr>
+                <w:b/>
+                <w:sz w:val="24"/>
+                <w:szCs w:val="24"/>
+              </w:rPr>
+              <w:t xml:space="preserve"> Brainstorming</w:t>
             </w:r>
           </w:p>
         </w:tc>
@@ -211,7 +367,7 @@
           <w:p>
             <w:pPr>
               <w:spacing w:before="60" w:line="276" w:lineRule="auto"/>
-              <w:jc w:val="both"/>
+              <w:jc w:val="left"/>
               <w:rPr>
                 <w:b/>
                 <w:sz w:val="24"/>
@@ -248,7 +404,7 @@
           <w:p>
             <w:pPr>
               <w:spacing w:before="60" w:line="276" w:lineRule="auto"/>
-              <w:jc w:val="both"/>
+              <w:jc w:val="left"/>
               <w:rPr>
                 <w:bCs/>
                 <w:sz w:val="24"/>
@@ -322,7 +478,7 @@
           <w:p>
             <w:pPr>
               <w:spacing w:before="60" w:line="276" w:lineRule="auto"/>
-              <w:jc w:val="both"/>
+              <w:jc w:val="left"/>
               <w:rPr>
                 <w:bCs/>
                 <w:sz w:val="24"/>
@@ -341,7 +497,7 @@
           <w:p>
             <w:pPr>
               <w:spacing w:before="60" w:line="276" w:lineRule="auto"/>
-              <w:jc w:val="both"/>
+              <w:jc w:val="left"/>
               <w:rPr>
                 <w:bCs/>
                 <w:sz w:val="24"/>
@@ -360,7 +516,7 @@
           <w:p>
             <w:pPr>
               <w:spacing w:before="60" w:line="276" w:lineRule="auto"/>
-              <w:jc w:val="both"/>
+              <w:jc w:val="left"/>
               <w:rPr>
                 <w:bCs/>
                 <w:sz w:val="24"/>
@@ -379,7 +535,7 @@
           <w:p>
             <w:pPr>
               <w:spacing w:before="60" w:line="276" w:lineRule="auto"/>
-              <w:jc w:val="both"/>
+              <w:jc w:val="left"/>
               <w:rPr>
                 <w:bCs/>
                 <w:sz w:val="24"/>
@@ -398,7 +554,7 @@
           <w:p>
             <w:pPr>
               <w:spacing w:before="60" w:line="276" w:lineRule="auto"/>
-              <w:jc w:val="both"/>
+              <w:jc w:val="left"/>
               <w:rPr>
                 <w:bCs/>
                 <w:sz w:val="24"/>
@@ -417,7 +573,7 @@
           <w:p>
             <w:pPr>
               <w:spacing w:before="60" w:line="276" w:lineRule="auto"/>
-              <w:jc w:val="both"/>
+              <w:jc w:val="left"/>
               <w:rPr>
                 <w:bCs/>
                 <w:sz w:val="24"/>
@@ -436,7 +592,7 @@
           <w:p>
             <w:pPr>
               <w:spacing w:before="60" w:line="276" w:lineRule="auto"/>
-              <w:jc w:val="both"/>
+              <w:jc w:val="left"/>
               <w:rPr>
                 <w:bCs/>
                 <w:sz w:val="24"/>
@@ -455,7 +611,7 @@
           <w:p>
             <w:pPr>
               <w:spacing w:before="60" w:line="276" w:lineRule="auto"/>
-              <w:jc w:val="both"/>
+              <w:jc w:val="left"/>
               <w:rPr>
                 <w:bCs/>
                 <w:sz w:val="24"/>
@@ -474,7 +630,7 @@
           <w:p>
             <w:pPr>
               <w:spacing w:before="60" w:line="276" w:lineRule="auto"/>
-              <w:jc w:val="both"/>
+              <w:jc w:val="left"/>
               <w:rPr>
                 <w:bCs/>
                 <w:sz w:val="24"/>
@@ -549,7 +705,7 @@
           <w:p>
             <w:pPr>
               <w:spacing w:before="60" w:line="276" w:lineRule="auto"/>
-              <w:jc w:val="both"/>
+              <w:jc w:val="left"/>
               <w:rPr>
                 <w:bCs/>
                 <w:sz w:val="24"/>
@@ -568,7 +724,7 @@
           <w:p>
             <w:pPr>
               <w:spacing w:before="60" w:line="276" w:lineRule="auto"/>
-              <w:jc w:val="both"/>
+              <w:jc w:val="left"/>
               <w:rPr>
                 <w:bCs/>
                 <w:sz w:val="24"/>
@@ -587,7 +743,7 @@
           <w:p>
             <w:pPr>
               <w:spacing w:before="60" w:line="276" w:lineRule="auto"/>
-              <w:jc w:val="both"/>
+              <w:jc w:val="left"/>
               <w:rPr>
                 <w:bCs/>
                 <w:sz w:val="24"/>
@@ -606,7 +762,7 @@
           <w:p>
             <w:pPr>
               <w:spacing w:before="60" w:line="276" w:lineRule="auto"/>
-              <w:jc w:val="both"/>
+              <w:jc w:val="left"/>
               <w:rPr>
                 <w:bCs/>
                 <w:sz w:val="24"/>
@@ -625,7 +781,7 @@
           <w:p>
             <w:pPr>
               <w:spacing w:before="60" w:line="276" w:lineRule="auto"/>
-              <w:jc w:val="both"/>
+              <w:jc w:val="left"/>
               <w:rPr>
                 <w:bCs/>
                 <w:sz w:val="24"/>
@@ -644,7 +800,7 @@
           <w:p>
             <w:pPr>
               <w:spacing w:before="60" w:line="276" w:lineRule="auto"/>
-              <w:jc w:val="both"/>
+              <w:jc w:val="left"/>
               <w:rPr>
                 <w:bCs/>
                 <w:sz w:val="24"/>
@@ -663,7 +819,7 @@
           <w:p>
             <w:pPr>
               <w:spacing w:before="60" w:line="276" w:lineRule="auto"/>
-              <w:jc w:val="both"/>
+              <w:jc w:val="left"/>
               <w:rPr>
                 <w:bCs/>
                 <w:sz w:val="24"/>
@@ -682,7 +838,7 @@
           <w:p>
             <w:pPr>
               <w:spacing w:before="60" w:line="276" w:lineRule="auto"/>
-              <w:jc w:val="both"/>
+              <w:jc w:val="left"/>
               <w:rPr>
                 <w:bCs/>
                 <w:sz w:val="24"/>
@@ -701,7 +857,7 @@
           <w:p>
             <w:pPr>
               <w:spacing w:before="60" w:line="276" w:lineRule="auto"/>
-              <w:jc w:val="both"/>
+              <w:jc w:val="left"/>
               <w:rPr>
                 <w:bCs/>
                 <w:sz w:val="24"/>
@@ -776,7 +932,7 @@
           <w:p>
             <w:pPr>
               <w:spacing w:before="60" w:line="276" w:lineRule="auto"/>
-              <w:jc w:val="both"/>
+              <w:jc w:val="left"/>
               <w:rPr>
                 <w:bCs/>
                 <w:sz w:val="24"/>
@@ -795,7 +951,7 @@
           <w:p>
             <w:pPr>
               <w:spacing w:before="60" w:line="276" w:lineRule="auto"/>
-              <w:jc w:val="both"/>
+              <w:jc w:val="left"/>
               <w:rPr>
                 <w:bCs/>
                 <w:sz w:val="24"/>
@@ -814,7 +970,7 @@
           <w:p>
             <w:pPr>
               <w:spacing w:before="60" w:line="276" w:lineRule="auto"/>
-              <w:jc w:val="both"/>
+              <w:jc w:val="left"/>
               <w:rPr>
                 <w:bCs/>
                 <w:sz w:val="24"/>
@@ -833,7 +989,7 @@
           <w:p>
             <w:pPr>
               <w:spacing w:before="60" w:line="276" w:lineRule="auto"/>
-              <w:jc w:val="both"/>
+              <w:jc w:val="left"/>
               <w:rPr>
                 <w:bCs/>
                 <w:sz w:val="24"/>
@@ -852,7 +1008,7 @@
           <w:p>
             <w:pPr>
               <w:spacing w:before="60" w:line="276" w:lineRule="auto"/>
-              <w:jc w:val="both"/>
+              <w:jc w:val="left"/>
               <w:rPr>
                 <w:bCs/>
                 <w:sz w:val="24"/>
@@ -871,7 +1027,7 @@
           <w:p>
             <w:pPr>
               <w:spacing w:before="60" w:line="276" w:lineRule="auto"/>
-              <w:jc w:val="both"/>
+              <w:jc w:val="left"/>
               <w:rPr>
                 <w:bCs/>
                 <w:sz w:val="24"/>
@@ -890,7 +1046,7 @@
           <w:p>
             <w:pPr>
               <w:spacing w:before="60" w:line="276" w:lineRule="auto"/>
-              <w:jc w:val="both"/>
+              <w:jc w:val="left"/>
               <w:rPr>
                 <w:bCs/>
                 <w:sz w:val="24"/>
@@ -909,7 +1065,7 @@
           <w:p>
             <w:pPr>
               <w:spacing w:before="60" w:line="276" w:lineRule="auto"/>
-              <w:jc w:val="both"/>
+              <w:jc w:val="left"/>
               <w:rPr>
                 <w:bCs/>
                 <w:sz w:val="24"/>
@@ -1031,7 +1187,7 @@
           <w:p>
             <w:pPr>
               <w:spacing w:before="60" w:line="276" w:lineRule="auto"/>
-              <w:jc w:val="both"/>
+              <w:jc w:val="left"/>
               <w:rPr>
                 <w:bCs/>
                 <w:sz w:val="24"/>
@@ -1050,39 +1206,20 @@
           <w:p>
             <w:pPr>
               <w:spacing w:before="60" w:line="276" w:lineRule="auto"/>
-              <w:jc w:val="both"/>
-              <w:rPr>
-                <w:bCs/>
-                <w:sz w:val="24"/>
-                <w:szCs w:val="24"/>
-              </w:rPr>
-            </w:pPr>
-            <w:r>
-              <w:rPr>
-                <w:bCs/>
-                <w:sz w:val="24"/>
-                <w:szCs w:val="24"/>
-              </w:rPr>
-              <w:t xml:space="preserve">{fiveWhyNarrative}</w:t>
-            </w:r>
-          </w:p>
-          <w:p>
-            <w:pPr>
-              <w:spacing w:before="60" w:line="276" w:lineRule="auto"/>
-              <w:jc w:val="both"/>
-              <w:rPr>
-                <w:bCs/>
-                <w:sz w:val="24"/>
-                <w:szCs w:val="24"/>
-              </w:rPr>
-            </w:pPr>
-            <w:r>
-              <w:rPr>
-                <w:bCs/>
-                <w:sz w:val="24"/>
-                <w:szCs w:val="24"/>
-              </w:rPr>
-              <w:t xml:space="preserve"/>
+              <w:jc w:val="left"/>
+              <w:rPr>
+                <w:bCs/>
+                <w:sz w:val="24"/>
+                <w:szCs w:val="24"/>
+              </w:rPr>
+            </w:pPr>
+            <w:r>
+              <w:rPr>
+                <w:bCs/>
+                <w:sz w:val="24"/>
+                <w:szCs w:val="24"/>
+              </w:rPr>
+              <w:t xml:space="preserve">{@fiveWhyNarrativeXml}</w:t>
             </w:r>
           </w:p>
         </w:tc>
@@ -1106,7 +1243,7 @@
           <w:p>
             <w:pPr>
               <w:spacing w:before="60" w:line="276" w:lineRule="auto"/>
-              <w:jc w:val="both"/>
+              <w:jc w:val="left"/>
               <w:rPr>
                 <w:bCs/>
                 <w:sz w:val="24"/>
@@ -1125,20 +1262,20 @@
           <w:p>
             <w:pPr>
               <w:spacing w:before="60" w:line="276" w:lineRule="auto"/>
-              <w:jc w:val="both"/>
-              <w:rPr>
-                <w:bCs/>
-                <w:sz w:val="24"/>
-                <w:szCs w:val="24"/>
-              </w:rPr>
-            </w:pPr>
-            <w:r>
-              <w:rPr>
-                <w:bCs/>
-                <w:sz w:val="24"/>
-                <w:szCs w:val="24"/>
-              </w:rPr>
-              <w:t xml:space="preserve">{brainstorming}</w:t>
+              <w:jc w:val="left"/>
+              <w:rPr>
+                <w:bCs/>
+                <w:sz w:val="24"/>
+                <w:szCs w:val="24"/>
+              </w:rPr>
+            </w:pPr>
+            <w:r>
+              <w:rPr>
+                <w:bCs/>
+                <w:sz w:val="24"/>
+                <w:szCs w:val="24"/>
+              </w:rPr>
+              <w:t xml:space="preserve">{@brainstormingXml}</w:t>
             </w:r>
           </w:p>
         </w:tc>
@@ -1162,7 +1299,7 @@
           <w:p>
             <w:pPr>
               <w:spacing w:before="60" w:line="276" w:lineRule="auto"/>
-              <w:jc w:val="both"/>
+              <w:jc w:val="left"/>
               <w:rPr>
                 <w:bCs/>
                 <w:sz w:val="24"/>
@@ -1181,20 +1318,20 @@
           <w:p>
             <w:pPr>
               <w:spacing w:before="60" w:line="276" w:lineRule="auto"/>
-              <w:jc w:val="both"/>
-              <w:rPr>
-                <w:bCs/>
-                <w:sz w:val="24"/>
-                <w:szCs w:val="24"/>
-              </w:rPr>
-            </w:pPr>
-            <w:r>
-              <w:rPr>
-                <w:bCs/>
-                <w:sz w:val="24"/>
-                <w:szCs w:val="24"/>
-              </w:rPr>
-              <w:t xml:space="preserve">{analyzeOtherTools}</w:t>
+              <w:jc w:val="left"/>
+              <w:rPr>
+                <w:bCs/>
+                <w:sz w:val="24"/>
+                <w:szCs w:val="24"/>
+              </w:rPr>
+            </w:pPr>
+            <w:r>
+              <w:rPr>
+                <w:bCs/>
+                <w:sz w:val="24"/>
+                <w:szCs w:val="24"/>
+              </w:rPr>
+              <w:t xml:space="preserve">{@analyzeOtherToolsXml}</w:t>
             </w:r>
           </w:p>
         </w:tc>
@@ -1218,7 +1355,7 @@
           <w:p>
             <w:pPr>
               <w:spacing w:before="60" w:line="276" w:lineRule="auto"/>
-              <w:jc w:val="both"/>
+              <w:jc w:val="left"/>
               <w:rPr>
                 <w:bCs/>
                 <w:sz w:val="24"/>
@@ -1292,20 +1429,20 @@
           <w:p>
             <w:pPr>
               <w:spacing w:before="60" w:line="276" w:lineRule="auto"/>
-              <w:jc w:val="both"/>
-              <w:rPr>
-                <w:bCs/>
-                <w:sz w:val="24"/>
-                <w:szCs w:val="24"/>
-              </w:rPr>
-            </w:pPr>
-            <w:r>
-              <w:rPr>
-                <w:bCs/>
-                <w:sz w:val="24"/>
-                <w:szCs w:val="24"/>
-              </w:rPr>
-              <w:t xml:space="preserve">{investigationOutcome}</w:t>
+              <w:jc w:val="left"/>
+              <w:rPr>
+                <w:bCs/>
+                <w:sz w:val="24"/>
+                <w:szCs w:val="24"/>
+              </w:rPr>
+            </w:pPr>
+            <w:r>
+              <w:rPr>
+                <w:bCs/>
+                <w:sz w:val="24"/>
+                <w:szCs w:val="24"/>
+              </w:rPr>
+              <w:t xml:space="preserve">{@investigationOutcomeXml}</w:t>
             </w:r>
           </w:p>
         </w:tc>
@@ -1367,77 +1504,20 @@
           <w:p>
             <w:pPr>
               <w:spacing w:before="60" w:line="276" w:lineRule="auto"/>
-              <w:jc w:val="both"/>
-              <w:rPr>
-                <w:bCs/>
-                <w:sz w:val="24"/>
-                <w:szCs w:val="24"/>
-              </w:rPr>
-            </w:pPr>
-            <w:r>
-              <w:rPr>
-                <w:bCs/>
-                <w:sz w:val="24"/>
-                <w:szCs w:val="24"/>
-              </w:rPr>
-              <w:t xml:space="preserve">{rootCauseNarrative}</w:t>
-            </w:r>
-          </w:p>
-          <w:p>
-            <w:pPr>
-              <w:spacing w:before="60" w:line="276" w:lineRule="auto"/>
-              <w:jc w:val="both"/>
-              <w:rPr>
-                <w:bCs/>
-                <w:sz w:val="24"/>
-                <w:szCs w:val="24"/>
-              </w:rPr>
-            </w:pPr>
-            <w:r>
-              <w:rPr>
-                <w:bCs/>
-                <w:sz w:val="24"/>
-                <w:szCs w:val="24"/>
-              </w:rPr>
-              <w:t xml:space="preserve">Primary Root Cause Level 1: {primaryLevel1}</w:t>
-            </w:r>
-          </w:p>
-          <w:p>
-            <w:pPr>
-              <w:spacing w:before="60" w:line="276" w:lineRule="auto"/>
-              <w:jc w:val="both"/>
-              <w:rPr>
-                <w:bCs/>
-                <w:sz w:val="24"/>
-                <w:szCs w:val="24"/>
-              </w:rPr>
-            </w:pPr>
-            <w:r>
-              <w:rPr>
-                <w:bCs/>
-                <w:sz w:val="24"/>
-                <w:szCs w:val="24"/>
-              </w:rPr>
-              <w:t xml:space="preserve">Secondary Root Cause Level 2: {secondaryLevel2}</w:t>
-            </w:r>
-          </w:p>
-          <w:p>
-            <w:pPr>
-              <w:spacing w:before="60" w:line="276" w:lineRule="auto"/>
-              <w:jc w:val="both"/>
-              <w:rPr>
-                <w:bCs/>
-                <w:sz w:val="24"/>
-                <w:szCs w:val="24"/>
-              </w:rPr>
-            </w:pPr>
-            <w:r>
-              <w:rPr>
-                <w:bCs/>
-                <w:sz w:val="24"/>
-                <w:szCs w:val="24"/>
-              </w:rPr>
-              <w:t xml:space="preserve">Third Root Cause Level 3: {thirdLevel3}</w:t>
+              <w:jc w:val="left"/>
+              <w:rPr>
+                <w:bCs/>
+                <w:sz w:val="24"/>
+                <w:szCs w:val="24"/>
+              </w:rPr>
+            </w:pPr>
+            <w:r>
+              <w:rPr>
+                <w:bCs/>
+                <w:sz w:val="24"/>
+                <w:szCs w:val="24"/>
+              </w:rPr>
+              <w:t xml:space="preserve">{@rootCauseNarrativeXml}</w:t>
             </w:r>
           </w:p>
         </w:tc>
@@ -1499,7 +1579,7 @@
           <w:p>
             <w:pPr>
               <w:spacing w:before="60" w:line="276" w:lineRule="auto"/>
-              <w:jc w:val="both"/>
+              <w:jc w:val="left"/>
               <w:rPr>
                 <w:bCs/>
                 <w:sz w:val="24"/>
@@ -1518,7 +1598,7 @@
           <w:p>
             <w:pPr>
               <w:spacing w:before="60" w:line="276" w:lineRule="auto"/>
-              <w:jc w:val="both"/>
+              <w:jc w:val="left"/>
               <w:rPr>
                 <w:bCs/>
                 <w:sz w:val="24"/>
@@ -1537,7 +1617,7 @@
           <w:p>
             <w:pPr>
               <w:spacing w:before="60" w:line="276" w:lineRule="auto"/>
-              <w:jc w:val="both"/>
+              <w:jc w:val="left"/>
               <w:rPr>
                 <w:bCs/>
                 <w:sz w:val="24"/>
@@ -1556,7 +1636,7 @@
           <w:p>
             <w:pPr>
               <w:spacing w:before="60" w:line="276" w:lineRule="auto"/>
-              <w:jc w:val="both"/>
+              <w:jc w:val="left"/>
               <w:rPr>
                 <w:bCs/>
                 <w:sz w:val="24"/>
@@ -1575,7 +1655,7 @@
           <w:p>
             <w:pPr>
               <w:spacing w:before="60" w:line="276" w:lineRule="auto"/>
-              <w:jc w:val="both"/>
+              <w:jc w:val="left"/>
               <w:rPr>
                 <w:bCs/>
                 <w:sz w:val="24"/>
@@ -1613,7 +1693,7 @@
           <w:p>
             <w:pPr>
               <w:spacing w:before="60" w:line="276" w:lineRule="auto"/>
-              <w:jc w:val="both"/>
+              <w:jc w:val="left"/>
               <w:rPr>
                 <w:bCs/>
                 <w:sz w:val="24"/>
@@ -1632,7 +1712,7 @@
           <w:p>
             <w:pPr>
               <w:spacing w:before="60" w:line="276" w:lineRule="auto"/>
-              <w:jc w:val="both"/>
+              <w:jc w:val="left"/>
               <w:rPr>
                 <w:bCs/>
                 <w:sz w:val="24"/>
@@ -1651,7 +1731,7 @@
           <w:p>
             <w:pPr>
               <w:spacing w:before="60" w:line="276" w:lineRule="auto"/>
-              <w:jc w:val="both"/>
+              <w:jc w:val="left"/>
               <w:rPr>
                 <w:bCs/>
                 <w:sz w:val="24"/>
@@ -1670,7 +1750,7 @@
           <w:p>
             <w:pPr>
               <w:spacing w:before="60" w:line="276" w:lineRule="auto"/>
-              <w:jc w:val="both"/>
+              <w:jc w:val="left"/>
               <w:rPr>
                 <w:bCs/>
                 <w:sz w:val="24"/>
@@ -1689,7 +1769,7 @@
           <w:p>
             <w:pPr>
               <w:spacing w:before="60" w:line="276" w:lineRule="auto"/>
-              <w:jc w:val="both"/>
+              <w:jc w:val="left"/>
               <w:rPr>
                 <w:bCs/>
                 <w:sz w:val="24"/>
@@ -1708,7 +1788,7 @@
           <w:p>
             <w:pPr>
               <w:spacing w:before="60" w:line="276" w:lineRule="auto"/>
-              <w:jc w:val="both"/>
+              <w:jc w:val="left"/>
               <w:rPr>
                 <w:bCs/>
                 <w:sz w:val="24"/>
@@ -1727,7 +1807,7 @@
           <w:p>
             <w:pPr>
               <w:spacing w:before="60" w:line="276" w:lineRule="auto"/>
-              <w:jc w:val="both"/>
+              <w:jc w:val="left"/>
               <w:rPr>
                 <w:bCs/>
                 <w:sz w:val="24"/>
@@ -1746,7 +1826,7 @@
           <w:p>
             <w:pPr>
               <w:spacing w:before="60" w:line="276" w:lineRule="auto"/>
-              <w:jc w:val="both"/>
+              <w:jc w:val="left"/>
               <w:rPr>
                 <w:bCs/>
                 <w:sz w:val="24"/>
@@ -1819,20 +1899,20 @@
           <w:p>
             <w:pPr>
               <w:spacing w:before="60" w:line="276" w:lineRule="auto"/>
-              <w:jc w:val="both"/>
-              <w:rPr>
-                <w:bCs/>
-                <w:sz w:val="24"/>
-                <w:szCs w:val="24"/>
-              </w:rPr>
-            </w:pPr>
-            <w:r>
-              <w:rPr>
-                <w:bCs/>
-                <w:sz w:val="24"/>
-                <w:szCs w:val="24"/>
-              </w:rPr>
-              <w:t xml:space="preserve">{correctiveActions}</w:t>
+              <w:jc w:val="left"/>
+              <w:rPr>
+                <w:bCs/>
+                <w:sz w:val="24"/>
+                <w:szCs w:val="24"/>
+              </w:rPr>
+            </w:pPr>
+            <w:r>
+              <w:rPr>
+                <w:bCs/>
+                <w:sz w:val="24"/>
+                <w:szCs w:val="24"/>
+              </w:rPr>
+              <w:t xml:space="preserve">{@correctiveActionsXml}</w:t>
             </w:r>
           </w:p>
         </w:tc>
@@ -1856,7 +1936,7 @@
           <w:p>
             <w:pPr>
               <w:spacing w:before="60" w:line="276" w:lineRule="auto"/>
-              <w:jc w:val="both"/>
+              <w:jc w:val="left"/>
               <w:rPr>
                 <w:bCs/>
                 <w:sz w:val="24"/>
@@ -1875,7 +1955,7 @@
           <w:p>
             <w:pPr>
               <w:spacing w:before="60" w:line="276" w:lineRule="auto"/>
-              <w:jc w:val="both"/>
+              <w:jc w:val="left"/>
               <w:rPr>
                 <w:bCs/>
                 <w:sz w:val="24"/>
@@ -1894,7 +1974,7 @@
           <w:p>
             <w:pPr>
               <w:spacing w:before="60" w:line="276" w:lineRule="auto"/>
-              <w:jc w:val="both"/>
+              <w:jc w:val="left"/>
               <w:rPr>
                 <w:bCs/>
                 <w:sz w:val="24"/>
@@ -1913,7 +1993,7 @@
           <w:p>
             <w:pPr>
               <w:spacing w:before="60" w:line="276" w:lineRule="auto"/>
-              <w:jc w:val="both"/>
+              <w:jc w:val="left"/>
               <w:rPr>
                 <w:bCs/>
                 <w:sz w:val="24"/>
@@ -1932,7 +2012,7 @@
           <w:p>
             <w:pPr>
               <w:spacing w:before="60" w:line="276" w:lineRule="auto"/>
-              <w:jc w:val="both"/>
+              <w:jc w:val="left"/>
               <w:rPr>
                 <w:bCs/>
                 <w:sz w:val="24"/>
@@ -1951,7 +2031,7 @@
           <w:p>
             <w:pPr>
               <w:spacing w:before="60" w:line="276" w:lineRule="auto"/>
-              <w:jc w:val="both"/>
+              <w:jc w:val="left"/>
               <w:rPr>
                 <w:bCs/>
                 <w:sz w:val="24"/>
@@ -1970,7 +2050,7 @@
           <w:p>
             <w:pPr>
               <w:spacing w:before="60" w:line="276" w:lineRule="auto"/>
-              <w:jc w:val="both"/>
+              <w:jc w:val="left"/>
               <w:rPr>
                 <w:bCs/>
                 <w:sz w:val="24"/>
@@ -2043,20 +2123,20 @@
           <w:p>
             <w:pPr>
               <w:spacing w:before="60" w:line="276" w:lineRule="auto"/>
-              <w:jc w:val="both"/>
-              <w:rPr>
-                <w:bCs/>
-                <w:sz w:val="24"/>
-                <w:szCs w:val="24"/>
-              </w:rPr>
-            </w:pPr>
-            <w:r>
-              <w:rPr>
-                <w:bCs/>
-                <w:sz w:val="24"/>
-                <w:szCs w:val="24"/>
-              </w:rPr>
-              <w:t xml:space="preserve">{preventiveActions}</w:t>
+              <w:jc w:val="left"/>
+              <w:rPr>
+                <w:bCs/>
+                <w:sz w:val="24"/>
+                <w:szCs w:val="24"/>
+              </w:rPr>
+            </w:pPr>
+            <w:r>
+              <w:rPr>
+                <w:bCs/>
+                <w:sz w:val="24"/>
+                <w:szCs w:val="24"/>
+              </w:rPr>
+              <w:t xml:space="preserve">{@preventiveActionsXml}</w:t>
             </w:r>
           </w:p>
         </w:tc>
@@ -2138,20 +2218,20 @@
           <w:p>
             <w:pPr>
               <w:spacing w:before="60" w:line="276" w:lineRule="auto"/>
-              <w:jc w:val="both"/>
-              <w:rPr>
-                <w:bCs/>
-                <w:sz w:val="24"/>
-                <w:szCs w:val="24"/>
-              </w:rPr>
-            </w:pPr>
-            <w:r>
-              <w:rPr>
-                <w:bCs/>
-                <w:sz w:val="24"/>
-                <w:szCs w:val="24"/>
-              </w:rPr>
-              <w:t xml:space="preserve">{documentsReviewed}</w:t>
+              <w:jc w:val="left"/>
+              <w:rPr>
+                <w:bCs/>
+                <w:sz w:val="24"/>
+                <w:szCs w:val="24"/>
+              </w:rPr>
+            </w:pPr>
+            <w:r>
+              <w:rPr>
+                <w:bCs/>
+                <w:sz w:val="24"/>
+                <w:szCs w:val="24"/>
+              </w:rPr>
+              <w:t xml:space="preserve">{@documentsReviewedXml}</w:t>
             </w:r>
           </w:p>
         </w:tc>
@@ -2211,7 +2291,7 @@
           <w:p>
             <w:pPr>
               <w:spacing w:before="60" w:line="276" w:lineRule="auto"/>
-              <w:jc w:val="both"/>
+              <w:jc w:val="left"/>
               <w:rPr>
                 <w:bCs/>
                 <w:sz w:val="24"/>
@@ -2230,7 +2310,7 @@
           <w:p>
             <w:pPr>
               <w:spacing w:before="60" w:line="276" w:lineRule="auto"/>
-              <w:jc w:val="both"/>
+              <w:jc w:val="left"/>
               <w:rPr>
                 <w:bCs/>
                 <w:sz w:val="24"/>
@@ -2249,7 +2329,7 @@
           <w:p>
             <w:pPr>
               <w:spacing w:before="60" w:line="276" w:lineRule="auto"/>
-              <w:jc w:val="both"/>
+              <w:jc w:val="left"/>
               <w:rPr>
                 <w:bCs/>
                 <w:sz w:val="24"/>

</xml_diff>

<commit_message>
processing math, Bold, italic, underline, images, colors, fixing question parsing when importing report and when exporting report
</commit_message>
<xml_diff>
--- a/templates/investigation-report-template.docx
+++ b/templates/investigation-report-template.docx
@@ -491,158 +491,6 @@
                 <w:sz w:val="24"/>
                 <w:szCs w:val="24"/>
               </w:rPr>
-              <w:t xml:space="preserve">Following checks shall be considered while writing the “Define” section.</w:t>
-            </w:r>
-          </w:p>
-          <w:p>
-            <w:pPr>
-              <w:spacing w:before="60" w:line="276" w:lineRule="auto"/>
-              <w:jc w:val="left"/>
-              <w:rPr>
-                <w:bCs/>
-                <w:sz w:val="24"/>
-                <w:szCs w:val="24"/>
-              </w:rPr>
-            </w:pPr>
-            <w:r>
-              <w:rPr>
-                <w:bCs/>
-                <w:sz w:val="24"/>
-                <w:szCs w:val="24"/>
-              </w:rPr>
-              <w:t xml:space="preserve">1. Clearly define what happens actually.</w:t>
-            </w:r>
-          </w:p>
-          <w:p>
-            <w:pPr>
-              <w:spacing w:before="60" w:line="276" w:lineRule="auto"/>
-              <w:jc w:val="left"/>
-              <w:rPr>
-                <w:bCs/>
-                <w:sz w:val="24"/>
-                <w:szCs w:val="24"/>
-              </w:rPr>
-            </w:pPr>
-            <w:r>
-              <w:rPr>
-                <w:bCs/>
-                <w:sz w:val="24"/>
-                <w:szCs w:val="24"/>
-              </w:rPr>
-              <w:t xml:space="preserve">2. Explain what is different than expected.</w:t>
-            </w:r>
-          </w:p>
-          <w:p>
-            <w:pPr>
-              <w:spacing w:before="60" w:line="276" w:lineRule="auto"/>
-              <w:jc w:val="left"/>
-              <w:rPr>
-                <w:bCs/>
-                <w:sz w:val="24"/>
-                <w:szCs w:val="24"/>
-              </w:rPr>
-            </w:pPr>
-            <w:r>
-              <w:rPr>
-                <w:bCs/>
-                <w:sz w:val="24"/>
-                <w:szCs w:val="24"/>
-              </w:rPr>
-              <w:t xml:space="preserve">3. Mention the location where the deviation has occurred.</w:t>
-            </w:r>
-          </w:p>
-          <w:p>
-            <w:pPr>
-              <w:spacing w:before="60" w:line="276" w:lineRule="auto"/>
-              <w:jc w:val="left"/>
-              <w:rPr>
-                <w:bCs/>
-                <w:sz w:val="24"/>
-                <w:szCs w:val="24"/>
-              </w:rPr>
-            </w:pPr>
-            <w:r>
-              <w:rPr>
-                <w:bCs/>
-                <w:sz w:val="24"/>
-                <w:szCs w:val="24"/>
-              </w:rPr>
-              <w:t xml:space="preserve">4. Date/time of deviation occurrence and date/time of detection.</w:t>
-            </w:r>
-          </w:p>
-          <w:p>
-            <w:pPr>
-              <w:spacing w:before="60" w:line="276" w:lineRule="auto"/>
-              <w:jc w:val="left"/>
-              <w:rPr>
-                <w:bCs/>
-                <w:sz w:val="24"/>
-                <w:szCs w:val="24"/>
-              </w:rPr>
-            </w:pPr>
-            <w:r>
-              <w:rPr>
-                <w:bCs/>
-                <w:sz w:val="24"/>
-                <w:szCs w:val="24"/>
-              </w:rPr>
-              <w:t xml:space="preserve">5. Mention the name of personnel who is involved in the deviation.</w:t>
-            </w:r>
-          </w:p>
-          <w:p>
-            <w:pPr>
-              <w:spacing w:before="60" w:line="276" w:lineRule="auto"/>
-              <w:jc w:val="left"/>
-              <w:rPr>
-                <w:bCs/>
-                <w:sz w:val="24"/>
-                <w:szCs w:val="24"/>
-              </w:rPr>
-            </w:pPr>
-            <w:r>
-              <w:rPr>
-                <w:bCs/>
-                <w:sz w:val="24"/>
-                <w:szCs w:val="24"/>
-              </w:rPr>
-              <w:t xml:space="preserve">6. Mention initial scope of deviation (impacted product/Material/Equipment/System/Batches/etc.)</w:t>
-            </w:r>
-          </w:p>
-          <w:p>
-            <w:pPr>
-              <w:spacing w:before="60" w:line="276" w:lineRule="auto"/>
-              <w:jc w:val="left"/>
-              <w:rPr>
-                <w:bCs/>
-                <w:sz w:val="24"/>
-                <w:szCs w:val="24"/>
-              </w:rPr>
-            </w:pPr>
-            <w:r>
-              <w:rPr>
-                <w:bCs/>
-                <w:sz w:val="24"/>
-                <w:szCs w:val="24"/>
-              </w:rPr>
-              <w:t xml:space="preserve"/>
-            </w:r>
-          </w:p>
-          <w:p>
-            <w:pPr>
-              <w:spacing w:before="60" w:line="276" w:lineRule="auto"/>
-              <w:jc w:val="left"/>
-              <w:rPr>
-                <w:bCs/>
-                <w:sz w:val="24"/>
-                <w:szCs w:val="24"/>
-              </w:rPr>
-            </w:pPr>
-            <w:r>
-              <w:rPr>
-                <w:bCs/>
-                <w:sz w:val="24"/>
-                <w:szCs w:val="24"/>
-              </w:rPr>
               <w:t xml:space="preserve">{@defineNarrativeXml}</w:t>
             </w:r>
           </w:p>
@@ -737,139 +585,6 @@
                 <w:sz w:val="24"/>
                 <w:szCs w:val="24"/>
               </w:rPr>
-              <w:t xml:space="preserve">Following checks shall be considered while writing the “Measure” section.</w:t>
-            </w:r>
-          </w:p>
-          <w:p>
-            <w:pPr>
-              <w:spacing w:before="60" w:line="276" w:lineRule="auto"/>
-              <w:jc w:val="left"/>
-              <w:rPr>
-                <w:bCs/>
-                <w:sz w:val="24"/>
-                <w:szCs w:val="24"/>
-              </w:rPr>
-            </w:pPr>
-            <w:r>
-              <w:rPr>
-                <w:bCs/>
-                <w:sz w:val="24"/>
-                <w:szCs w:val="24"/>
-              </w:rPr>
-              <w:t xml:space="preserve">1. Does the summary provide relevant facts and data/information reviewed?</w:t>
-            </w:r>
-          </w:p>
-          <w:p>
-            <w:pPr>
-              <w:spacing w:before="60" w:line="276" w:lineRule="auto"/>
-              <w:jc w:val="left"/>
-              <w:rPr>
-                <w:bCs/>
-                <w:sz w:val="24"/>
-                <w:szCs w:val="24"/>
-              </w:rPr>
-            </w:pPr>
-            <w:r>
-              <w:rPr>
-                <w:bCs/>
-                <w:sz w:val="24"/>
-                <w:szCs w:val="24"/>
-              </w:rPr>
-              <w:t xml:space="preserve">2. Is a summary of the analysis of the factors and data provided?</w:t>
-            </w:r>
-          </w:p>
-          <w:p>
-            <w:pPr>
-              <w:spacing w:before="60" w:line="276" w:lineRule="auto"/>
-              <w:jc w:val="left"/>
-              <w:rPr>
-                <w:bCs/>
-                <w:sz w:val="24"/>
-                <w:szCs w:val="24"/>
-              </w:rPr>
-            </w:pPr>
-            <w:r>
-              <w:rPr>
-                <w:bCs/>
-                <w:sz w:val="24"/>
-                <w:szCs w:val="24"/>
-              </w:rPr>
-              <w:t xml:space="preserve">3. Is a conclusion statement of the analysis and review provided?</w:t>
-            </w:r>
-          </w:p>
-          <w:p>
-            <w:pPr>
-              <w:spacing w:before="60" w:line="276" w:lineRule="auto"/>
-              <w:jc w:val="left"/>
-              <w:rPr>
-                <w:bCs/>
-                <w:sz w:val="24"/>
-                <w:szCs w:val="24"/>
-              </w:rPr>
-            </w:pPr>
-            <w:r>
-              <w:rPr>
-                <w:bCs/>
-                <w:sz w:val="24"/>
-                <w:szCs w:val="24"/>
-              </w:rPr>
-              <w:t xml:space="preserve">4. If there were Regulatory Notification, were details provided?</w:t>
-            </w:r>
-          </w:p>
-          <w:p>
-            <w:pPr>
-              <w:spacing w:before="60" w:line="276" w:lineRule="auto"/>
-              <w:jc w:val="left"/>
-              <w:rPr>
-                <w:bCs/>
-                <w:sz w:val="24"/>
-                <w:szCs w:val="24"/>
-              </w:rPr>
-            </w:pPr>
-            <w:r>
-              <w:rPr>
-                <w:bCs/>
-                <w:sz w:val="24"/>
-                <w:szCs w:val="24"/>
-              </w:rPr>
-              <w:t xml:space="preserve">5. Is the report written in a logical flow and easily understood by the reader?</w:t>
-            </w:r>
-          </w:p>
-          <w:p>
-            <w:pPr>
-              <w:spacing w:before="60" w:line="276" w:lineRule="auto"/>
-              <w:jc w:val="left"/>
-              <w:rPr>
-                <w:bCs/>
-                <w:sz w:val="24"/>
-                <w:szCs w:val="24"/>
-              </w:rPr>
-            </w:pPr>
-            <w:r>
-              <w:rPr>
-                <w:bCs/>
-                <w:sz w:val="24"/>
-                <w:szCs w:val="24"/>
-              </w:rPr>
-              <w:t xml:space="preserve"/>
-            </w:r>
-          </w:p>
-          <w:p>
-            <w:pPr>
-              <w:spacing w:before="60" w:line="276" w:lineRule="auto"/>
-              <w:jc w:val="left"/>
-              <w:rPr>
-                <w:bCs/>
-                <w:sz w:val="24"/>
-                <w:szCs w:val="24"/>
-              </w:rPr>
-            </w:pPr>
-            <w:r>
-              <w:rPr>
-                <w:bCs/>
-                <w:sz w:val="24"/>
-                <w:szCs w:val="24"/>
-              </w:rPr>
               <w:t xml:space="preserve">{@measureNarrativeXml}</w:t>
             </w:r>
           </w:p>
@@ -1706,140 +1421,7 @@
                 <w:sz w:val="24"/>
                 <w:szCs w:val="24"/>
               </w:rPr>
-              <w:t xml:space="preserve">Improve: Improve section covers the corrective actions.</w:t>
-            </w:r>
-          </w:p>
-          <w:p>
-            <w:pPr>
-              <w:spacing w:before="60" w:line="276" w:lineRule="auto"/>
-              <w:jc w:val="left"/>
-              <w:rPr>
-                <w:bCs/>
-                <w:sz w:val="24"/>
-                <w:szCs w:val="24"/>
-              </w:rPr>
-            </w:pPr>
-            <w:r>
-              <w:rPr>
-                <w:bCs/>
-                <w:sz w:val="24"/>
-                <w:szCs w:val="24"/>
-              </w:rPr>
-              <w:t xml:space="preserve">Following checks shall be considered while writing the “Improve” section.</w:t>
-            </w:r>
-          </w:p>
-          <w:p>
-            <w:pPr>
-              <w:spacing w:before="60" w:line="276" w:lineRule="auto"/>
-              <w:jc w:val="left"/>
-              <w:rPr>
-                <w:bCs/>
-                <w:sz w:val="24"/>
-                <w:szCs w:val="24"/>
-              </w:rPr>
-            </w:pPr>
-            <w:r>
-              <w:rPr>
-                <w:bCs/>
-                <w:sz w:val="24"/>
-                <w:szCs w:val="24"/>
-              </w:rPr>
-              <w:t xml:space="preserve">1. Were specific corrective actions identified (including immediate actions)?</w:t>
-            </w:r>
-          </w:p>
-          <w:p>
-            <w:pPr>
-              <w:spacing w:before="60" w:line="276" w:lineRule="auto"/>
-              <w:jc w:val="left"/>
-              <w:rPr>
-                <w:bCs/>
-                <w:sz w:val="24"/>
-                <w:szCs w:val="24"/>
-              </w:rPr>
-            </w:pPr>
-            <w:r>
-              <w:rPr>
-                <w:bCs/>
-                <w:sz w:val="24"/>
-                <w:szCs w:val="24"/>
-              </w:rPr>
-              <w:t xml:space="preserve">2. Were specific corrective actions identified for each root cause?</w:t>
-            </w:r>
-          </w:p>
-          <w:p>
-            <w:pPr>
-              <w:spacing w:before="60" w:line="276" w:lineRule="auto"/>
-              <w:jc w:val="left"/>
-              <w:rPr>
-                <w:bCs/>
-                <w:sz w:val="24"/>
-                <w:szCs w:val="24"/>
-              </w:rPr>
-            </w:pPr>
-            <w:r>
-              <w:rPr>
-                <w:bCs/>
-                <w:sz w:val="24"/>
-                <w:szCs w:val="24"/>
-              </w:rPr>
-              <w:t xml:space="preserve">3. Was the corrective action assigned a unique number, responsible person and due date?</w:t>
-            </w:r>
-          </w:p>
-          <w:p>
-            <w:pPr>
-              <w:spacing w:before="60" w:line="276" w:lineRule="auto"/>
-              <w:jc w:val="left"/>
-              <w:rPr>
-                <w:bCs/>
-                <w:sz w:val="24"/>
-                <w:szCs w:val="24"/>
-              </w:rPr>
-            </w:pPr>
-            <w:r>
-              <w:rPr>
-                <w:bCs/>
-                <w:sz w:val="24"/>
-                <w:szCs w:val="24"/>
-              </w:rPr>
-              <w:t xml:space="preserve">4. Does the action describe the expected outcome that can be verified?</w:t>
-            </w:r>
-          </w:p>
-          <w:p>
-            <w:pPr>
-              <w:spacing w:before="60" w:line="276" w:lineRule="auto"/>
-              <w:jc w:val="left"/>
-              <w:rPr>
-                <w:bCs/>
-                <w:sz w:val="24"/>
-                <w:szCs w:val="24"/>
-              </w:rPr>
-            </w:pPr>
-            <w:r>
-              <w:rPr>
-                <w:bCs/>
-                <w:sz w:val="24"/>
-                <w:szCs w:val="24"/>
-              </w:rPr>
-              <w:t xml:space="preserve">5. Was effectiveness verification required or not, with rationale documented?</w:t>
-            </w:r>
-          </w:p>
-          <w:p>
-            <w:pPr>
-              <w:spacing w:before="60" w:line="276" w:lineRule="auto"/>
-              <w:jc w:val="left"/>
-              <w:rPr>
-                <w:bCs/>
-                <w:sz w:val="24"/>
-                <w:szCs w:val="24"/>
-              </w:rPr>
-            </w:pPr>
-            <w:r>
-              <w:rPr>
-                <w:bCs/>
-                <w:sz w:val="24"/>
-                <w:szCs w:val="24"/>
-              </w:rPr>
-              <w:t xml:space="preserve">6. Are the identified corrective actions achievable?</w:t>
+              <w:t xml:space="preserve">Improve:</w:t>
             </w:r>
           </w:p>
         </w:tc>
@@ -1949,121 +1531,7 @@
                 <w:sz w:val="24"/>
                 <w:szCs w:val="24"/>
               </w:rPr>
-              <w:t xml:space="preserve">Control: Control section covers the preventive actions.</w:t>
-            </w:r>
-          </w:p>
-          <w:p>
-            <w:pPr>
-              <w:spacing w:before="60" w:line="276" w:lineRule="auto"/>
-              <w:jc w:val="left"/>
-              <w:rPr>
-                <w:bCs/>
-                <w:sz w:val="24"/>
-                <w:szCs w:val="24"/>
-              </w:rPr>
-            </w:pPr>
-            <w:r>
-              <w:rPr>
-                <w:bCs/>
-                <w:sz w:val="24"/>
-                <w:szCs w:val="24"/>
-              </w:rPr>
-              <w:t xml:space="preserve">Following checks shall be considered while writing the “Control” section.</w:t>
-            </w:r>
-          </w:p>
-          <w:p>
-            <w:pPr>
-              <w:spacing w:before="60" w:line="276" w:lineRule="auto"/>
-              <w:jc w:val="left"/>
-              <w:rPr>
-                <w:bCs/>
-                <w:sz w:val="24"/>
-                <w:szCs w:val="24"/>
-              </w:rPr>
-            </w:pPr>
-            <w:r>
-              <w:rPr>
-                <w:bCs/>
-                <w:sz w:val="24"/>
-                <w:szCs w:val="24"/>
-              </w:rPr>
-              <w:t xml:space="preserve">1. Are specific preventive actions identified to prevent recurrence?</w:t>
-            </w:r>
-          </w:p>
-          <w:p>
-            <w:pPr>
-              <w:spacing w:before="60" w:line="276" w:lineRule="auto"/>
-              <w:jc w:val="left"/>
-              <w:rPr>
-                <w:bCs/>
-                <w:sz w:val="24"/>
-                <w:szCs w:val="24"/>
-              </w:rPr>
-            </w:pPr>
-            <w:r>
-              <w:rPr>
-                <w:bCs/>
-                <w:sz w:val="24"/>
-                <w:szCs w:val="24"/>
-              </w:rPr>
-              <w:t xml:space="preserve">2. Was the preventive action assigned a unique number, responsible person and due date?</w:t>
-            </w:r>
-          </w:p>
-          <w:p>
-            <w:pPr>
-              <w:spacing w:before="60" w:line="276" w:lineRule="auto"/>
-              <w:jc w:val="left"/>
-              <w:rPr>
-                <w:bCs/>
-                <w:sz w:val="24"/>
-                <w:szCs w:val="24"/>
-              </w:rPr>
-            </w:pPr>
-            <w:r>
-              <w:rPr>
-                <w:bCs/>
-                <w:sz w:val="24"/>
-                <w:szCs w:val="24"/>
-              </w:rPr>
-              <w:t xml:space="preserve">3. Does the action describe the expected outcome that can be verified?</w:t>
-            </w:r>
-          </w:p>
-          <w:p>
-            <w:pPr>
-              <w:spacing w:before="60" w:line="276" w:lineRule="auto"/>
-              <w:jc w:val="left"/>
-              <w:rPr>
-                <w:bCs/>
-                <w:sz w:val="24"/>
-                <w:szCs w:val="24"/>
-              </w:rPr>
-            </w:pPr>
-            <w:r>
-              <w:rPr>
-                <w:bCs/>
-                <w:sz w:val="24"/>
-                <w:szCs w:val="24"/>
-              </w:rPr>
-              <w:t xml:space="preserve">4. Was effectiveness verification required or not, with rationale documented?</w:t>
-            </w:r>
-          </w:p>
-          <w:p>
-            <w:pPr>
-              <w:spacing w:before="60" w:line="276" w:lineRule="auto"/>
-              <w:jc w:val="left"/>
-              <w:rPr>
-                <w:bCs/>
-                <w:sz w:val="24"/>
-                <w:szCs w:val="24"/>
-              </w:rPr>
-            </w:pPr>
-            <w:r>
-              <w:rPr>
-                <w:bCs/>
-                <w:sz w:val="24"/>
-                <w:szCs w:val="24"/>
-              </w:rPr>
-              <w:t xml:space="preserve">5. Are the identified preventive actions achievable?</w:t>
+              <w:t xml:space="preserve">Control:</w:t>
             </w:r>
           </w:p>
         </w:tc>

</xml_diff>

<commit_message>
fixing round trip error
</commit_message>
<xml_diff>
--- a/templates/investigation-report-template.docx
+++ b/templates/investigation-report-template.docx
@@ -78,14 +78,12 @@
               <w:spacing w:before="60" w:line="276" w:lineRule="auto"/>
               <w:jc w:val="left"/>
               <w:rPr>
-                <w:bCs/>
                 <w:sz w:val="24"/>
                 <w:szCs w:val="24"/>
               </w:rPr>
             </w:pPr>
             <w:r>
               <w:rPr>
-                <w:bCs/>
                 <w:sz w:val="24"/>
                 <w:szCs w:val="24"/>
               </w:rPr>
@@ -138,14 +136,12 @@
               <w:spacing w:before="60" w:line="276" w:lineRule="auto"/>
               <w:jc w:val="left"/>
               <w:rPr>
-                <w:bCs/>
                 <w:sz w:val="24"/>
                 <w:szCs w:val="24"/>
               </w:rPr>
             </w:pPr>
             <w:r>
               <w:rPr>
-                <w:bCs/>
                 <w:sz w:val="24"/>
                 <w:szCs w:val="24"/>
               </w:rPr>
@@ -380,7 +376,14 @@
                 <w:sz w:val="24"/>
                 <w:szCs w:val="24"/>
               </w:rPr>
-              <w:t xml:space="preserve">Other Tools (If any): {otherToolsDisplay}</w:t>
+              <w:t xml:space="preserve">Other Tools (If any): </w:t>
+            </w:r>
+            <w:r>
+              <w:rPr>
+                <w:sz w:val="24"/>
+                <w:szCs w:val="24"/>
+              </w:rPr>
+              <w:t xml:space="preserve">{otherToolsDisplay}</w:t>
             </w:r>
           </w:p>
         </w:tc>
@@ -406,14 +409,12 @@
               <w:spacing w:before="60" w:line="276" w:lineRule="auto"/>
               <w:jc w:val="left"/>
               <w:rPr>
-                <w:bCs/>
                 <w:sz w:val="24"/>
                 <w:szCs w:val="24"/>
               </w:rPr>
             </w:pPr>
             <w:r>
               <w:rPr>
-                <w:bCs/>
                 <w:sz w:val="24"/>
                 <w:szCs w:val="24"/>
               </w:rPr>
@@ -480,14 +481,12 @@
               <w:spacing w:before="60" w:line="276" w:lineRule="auto"/>
               <w:jc w:val="left"/>
               <w:rPr>
-                <w:bCs/>
                 <w:sz w:val="24"/>
                 <w:szCs w:val="24"/>
               </w:rPr>
             </w:pPr>
             <w:r>
               <w:rPr>
-                <w:bCs/>
                 <w:sz w:val="24"/>
                 <w:szCs w:val="24"/>
               </w:rPr>
@@ -555,14 +554,14 @@
               <w:spacing w:before="60" w:line="276" w:lineRule="auto"/>
               <w:jc w:val="left"/>
               <w:rPr>
-                <w:bCs/>
+                <w:b/>
                 <w:sz w:val="24"/>
                 <w:szCs w:val="24"/>
               </w:rPr>
             </w:pPr>
             <w:r>
               <w:rPr>
-                <w:bCs/>
+                <w:b/>
                 <w:sz w:val="24"/>
                 <w:szCs w:val="24"/>
               </w:rPr>
@@ -574,14 +573,12 @@
               <w:spacing w:before="60" w:line="276" w:lineRule="auto"/>
               <w:jc w:val="left"/>
               <w:rPr>
-                <w:bCs/>
                 <w:sz w:val="24"/>
                 <w:szCs w:val="24"/>
               </w:rPr>
             </w:pPr>
             <w:r>
               <w:rPr>
-                <w:bCs/>
                 <w:sz w:val="24"/>
                 <w:szCs w:val="24"/>
               </w:rPr>
@@ -649,14 +646,14 @@
               <w:spacing w:before="60" w:line="276" w:lineRule="auto"/>
               <w:jc w:val="left"/>
               <w:rPr>
-                <w:bCs/>
+                <w:b/>
                 <w:sz w:val="24"/>
                 <w:szCs w:val="24"/>
               </w:rPr>
             </w:pPr>
             <w:r>
               <w:rPr>
-                <w:bCs/>
+                <w:b/>
                 <w:sz w:val="24"/>
                 <w:szCs w:val="24"/>
               </w:rPr>
@@ -668,18 +665,25 @@
               <w:spacing w:before="60" w:line="276" w:lineRule="auto"/>
               <w:jc w:val="left"/>
               <w:rPr>
-                <w:bCs/>
+                <w:b/>
                 <w:sz w:val="24"/>
                 <w:szCs w:val="24"/>
               </w:rPr>
             </w:pPr>
             <w:r>
               <w:rPr>
-                <w:bCs/>
-                <w:sz w:val="24"/>
-                <w:szCs w:val="24"/>
-              </w:rPr>
-              <w:t xml:space="preserve">Man: {sixMMan}</w:t>
+                <w:b/>
+                <w:sz w:val="24"/>
+                <w:szCs w:val="24"/>
+              </w:rPr>
+              <w:t xml:space="preserve">Man: </w:t>
+            </w:r>
+            <w:r>
+              <w:rPr>
+                <w:sz w:val="24"/>
+                <w:szCs w:val="24"/>
+              </w:rPr>
+              <w:t xml:space="preserve">{sixMMan}</w:t>
             </w:r>
           </w:p>
           <w:p>
@@ -687,18 +691,25 @@
               <w:spacing w:before="60" w:line="276" w:lineRule="auto"/>
               <w:jc w:val="left"/>
               <w:rPr>
-                <w:bCs/>
+                <w:b/>
                 <w:sz w:val="24"/>
                 <w:szCs w:val="24"/>
               </w:rPr>
             </w:pPr>
             <w:r>
               <w:rPr>
-                <w:bCs/>
-                <w:sz w:val="24"/>
-                <w:szCs w:val="24"/>
-              </w:rPr>
-              <w:t xml:space="preserve">Machine: {sixMMachine}</w:t>
+                <w:b/>
+                <w:sz w:val="24"/>
+                <w:szCs w:val="24"/>
+              </w:rPr>
+              <w:t xml:space="preserve">Machine: </w:t>
+            </w:r>
+            <w:r>
+              <w:rPr>
+                <w:sz w:val="24"/>
+                <w:szCs w:val="24"/>
+              </w:rPr>
+              <w:t xml:space="preserve">{sixMMachine}</w:t>
             </w:r>
           </w:p>
           <w:p>
@@ -706,18 +717,25 @@
               <w:spacing w:before="60" w:line="276" w:lineRule="auto"/>
               <w:jc w:val="left"/>
               <w:rPr>
-                <w:bCs/>
+                <w:b/>
                 <w:sz w:val="24"/>
                 <w:szCs w:val="24"/>
               </w:rPr>
             </w:pPr>
             <w:r>
               <w:rPr>
-                <w:bCs/>
-                <w:sz w:val="24"/>
-                <w:szCs w:val="24"/>
-              </w:rPr>
-              <w:t xml:space="preserve">Measurement: {sixMMeasurement}</w:t>
+                <w:b/>
+                <w:sz w:val="24"/>
+                <w:szCs w:val="24"/>
+              </w:rPr>
+              <w:t xml:space="preserve">Measurement: </w:t>
+            </w:r>
+            <w:r>
+              <w:rPr>
+                <w:sz w:val="24"/>
+                <w:szCs w:val="24"/>
+              </w:rPr>
+              <w:t xml:space="preserve">{sixMMeasurement}</w:t>
             </w:r>
           </w:p>
           <w:p>
@@ -725,18 +743,25 @@
               <w:spacing w:before="60" w:line="276" w:lineRule="auto"/>
               <w:jc w:val="left"/>
               <w:rPr>
-                <w:bCs/>
+                <w:b/>
                 <w:sz w:val="24"/>
                 <w:szCs w:val="24"/>
               </w:rPr>
             </w:pPr>
             <w:r>
               <w:rPr>
-                <w:bCs/>
-                <w:sz w:val="24"/>
-                <w:szCs w:val="24"/>
-              </w:rPr>
-              <w:t xml:space="preserve">Material: {sixMMaterial}</w:t>
+                <w:b/>
+                <w:sz w:val="24"/>
+                <w:szCs w:val="24"/>
+              </w:rPr>
+              <w:t xml:space="preserve">Material: </w:t>
+            </w:r>
+            <w:r>
+              <w:rPr>
+                <w:sz w:val="24"/>
+                <w:szCs w:val="24"/>
+              </w:rPr>
+              <w:t xml:space="preserve">{sixMMaterial}</w:t>
             </w:r>
           </w:p>
           <w:p>
@@ -744,18 +769,25 @@
               <w:spacing w:before="60" w:line="276" w:lineRule="auto"/>
               <w:jc w:val="left"/>
               <w:rPr>
-                <w:bCs/>
+                <w:b/>
                 <w:sz w:val="24"/>
                 <w:szCs w:val="24"/>
               </w:rPr>
             </w:pPr>
             <w:r>
               <w:rPr>
-                <w:bCs/>
-                <w:sz w:val="24"/>
-                <w:szCs w:val="24"/>
-              </w:rPr>
-              <w:t xml:space="preserve">Method: {sixMMethod}</w:t>
+                <w:b/>
+                <w:sz w:val="24"/>
+                <w:szCs w:val="24"/>
+              </w:rPr>
+              <w:t xml:space="preserve">Method: </w:t>
+            </w:r>
+            <w:r>
+              <w:rPr>
+                <w:sz w:val="24"/>
+                <w:szCs w:val="24"/>
+              </w:rPr>
+              <w:t xml:space="preserve">{sixMMethod}</w:t>
             </w:r>
           </w:p>
           <w:p>
@@ -763,18 +795,25 @@
               <w:spacing w:before="60" w:line="276" w:lineRule="auto"/>
               <w:jc w:val="left"/>
               <w:rPr>
-                <w:bCs/>
+                <w:b/>
                 <w:sz w:val="24"/>
                 <w:szCs w:val="24"/>
               </w:rPr>
             </w:pPr>
             <w:r>
               <w:rPr>
-                <w:bCs/>
-                <w:sz w:val="24"/>
-                <w:szCs w:val="24"/>
-              </w:rPr>
-              <w:t xml:space="preserve">Milieu (Environment): {sixMMilieu}</w:t>
+                <w:b/>
+                <w:sz w:val="24"/>
+                <w:szCs w:val="24"/>
+              </w:rPr>
+              <w:t xml:space="preserve">Milieu (Environment): </w:t>
+            </w:r>
+            <w:r>
+              <w:rPr>
+                <w:sz w:val="24"/>
+                <w:szCs w:val="24"/>
+              </w:rPr>
+              <w:t xml:space="preserve">{sixMMilieu}</w:t>
             </w:r>
           </w:p>
           <w:p>
@@ -782,18 +821,25 @@
               <w:spacing w:before="60" w:line="276" w:lineRule="auto"/>
               <w:jc w:val="left"/>
               <w:rPr>
-                <w:bCs/>
+                <w:b/>
                 <w:sz w:val="24"/>
                 <w:szCs w:val="24"/>
               </w:rPr>
             </w:pPr>
             <w:r>
               <w:rPr>
-                <w:bCs/>
-                <w:sz w:val="24"/>
-                <w:szCs w:val="24"/>
-              </w:rPr>
-              <w:t xml:space="preserve">Conclusion: {sixMConclusion}</w:t>
+                <w:b/>
+                <w:sz w:val="24"/>
+                <w:szCs w:val="24"/>
+              </w:rPr>
+              <w:t xml:space="preserve">Conclusion: </w:t>
+            </w:r>
+            <w:r>
+              <w:rPr>
+                <w:sz w:val="24"/>
+                <w:szCs w:val="24"/>
+              </w:rPr>
+              <w:t xml:space="preserve">{sixMConclusion}</w:t>
             </w:r>
           </w:p>
         </w:tc>
@@ -904,14 +950,14 @@
               <w:spacing w:before="60" w:line="276" w:lineRule="auto"/>
               <w:jc w:val="left"/>
               <w:rPr>
-                <w:bCs/>
+                <w:b/>
                 <w:sz w:val="24"/>
                 <w:szCs w:val="24"/>
               </w:rPr>
             </w:pPr>
             <w:r>
               <w:rPr>
-                <w:bCs/>
+                <w:b/>
                 <w:sz w:val="24"/>
                 <w:szCs w:val="24"/>
               </w:rPr>
@@ -923,14 +969,12 @@
               <w:spacing w:before="60" w:line="276" w:lineRule="auto"/>
               <w:jc w:val="left"/>
               <w:rPr>
-                <w:bCs/>
                 <w:sz w:val="24"/>
                 <w:szCs w:val="24"/>
               </w:rPr>
             </w:pPr>
             <w:r>
               <w:rPr>
-                <w:bCs/>
                 <w:sz w:val="24"/>
                 <w:szCs w:val="24"/>
               </w:rPr>
@@ -960,14 +1004,14 @@
               <w:spacing w:before="60" w:line="276" w:lineRule="auto"/>
               <w:jc w:val="left"/>
               <w:rPr>
-                <w:bCs/>
+                <w:b/>
                 <w:sz w:val="24"/>
                 <w:szCs w:val="24"/>
               </w:rPr>
             </w:pPr>
             <w:r>
               <w:rPr>
-                <w:bCs/>
+                <w:b/>
                 <w:sz w:val="24"/>
                 <w:szCs w:val="24"/>
               </w:rPr>
@@ -979,14 +1023,12 @@
               <w:spacing w:before="60" w:line="276" w:lineRule="auto"/>
               <w:jc w:val="left"/>
               <w:rPr>
-                <w:bCs/>
                 <w:sz w:val="24"/>
                 <w:szCs w:val="24"/>
               </w:rPr>
             </w:pPr>
             <w:r>
               <w:rPr>
-                <w:bCs/>
                 <w:sz w:val="24"/>
                 <w:szCs w:val="24"/>
               </w:rPr>
@@ -1016,14 +1058,14 @@
               <w:spacing w:before="60" w:line="276" w:lineRule="auto"/>
               <w:jc w:val="left"/>
               <w:rPr>
-                <w:bCs/>
+                <w:b/>
                 <w:sz w:val="24"/>
                 <w:szCs w:val="24"/>
               </w:rPr>
             </w:pPr>
             <w:r>
               <w:rPr>
-                <w:bCs/>
+                <w:b/>
                 <w:sz w:val="24"/>
                 <w:szCs w:val="24"/>
               </w:rPr>
@@ -1035,14 +1077,12 @@
               <w:spacing w:before="60" w:line="276" w:lineRule="auto"/>
               <w:jc w:val="left"/>
               <w:rPr>
-                <w:bCs/>
                 <w:sz w:val="24"/>
                 <w:szCs w:val="24"/>
               </w:rPr>
             </w:pPr>
             <w:r>
               <w:rPr>
-                <w:bCs/>
                 <w:sz w:val="24"/>
                 <w:szCs w:val="24"/>
               </w:rPr>
@@ -1072,14 +1112,12 @@
               <w:spacing w:before="60" w:line="276" w:lineRule="auto"/>
               <w:jc w:val="left"/>
               <w:rPr>
-                <w:bCs/>
                 <w:sz w:val="24"/>
                 <w:szCs w:val="24"/>
               </w:rPr>
             </w:pPr>
             <w:r>
               <w:rPr>
-                <w:bCs/>
                 <w:sz w:val="24"/>
                 <w:szCs w:val="24"/>
               </w:rPr>
@@ -1146,14 +1184,12 @@
               <w:spacing w:before="60" w:line="276" w:lineRule="auto"/>
               <w:jc w:val="left"/>
               <w:rPr>
-                <w:bCs/>
                 <w:sz w:val="24"/>
                 <w:szCs w:val="24"/>
               </w:rPr>
             </w:pPr>
             <w:r>
               <w:rPr>
-                <w:bCs/>
                 <w:sz w:val="24"/>
                 <w:szCs w:val="24"/>
               </w:rPr>
@@ -1221,14 +1257,12 @@
               <w:spacing w:before="60" w:line="276" w:lineRule="auto"/>
               <w:jc w:val="left"/>
               <w:rPr>
-                <w:bCs/>
                 <w:sz w:val="24"/>
                 <w:szCs w:val="24"/>
               </w:rPr>
             </w:pPr>
             <w:r>
               <w:rPr>
-                <w:bCs/>
                 <w:sz w:val="24"/>
                 <w:szCs w:val="24"/>
               </w:rPr>
@@ -1296,18 +1330,25 @@
               <w:spacing w:before="60" w:line="276" w:lineRule="auto"/>
               <w:jc w:val="left"/>
               <w:rPr>
-                <w:bCs/>
+                <w:b/>
                 <w:sz w:val="24"/>
                 <w:szCs w:val="24"/>
               </w:rPr>
             </w:pPr>
             <w:r>
               <w:rPr>
-                <w:bCs/>
-                <w:sz w:val="24"/>
-                <w:szCs w:val="24"/>
-              </w:rPr>
-              <w:t xml:space="preserve">System: {impactSystem}</w:t>
+                <w:b/>
+                <w:sz w:val="24"/>
+                <w:szCs w:val="24"/>
+              </w:rPr>
+              <w:t xml:space="preserve">System: </w:t>
+            </w:r>
+            <w:r>
+              <w:rPr>
+                <w:sz w:val="24"/>
+                <w:szCs w:val="24"/>
+              </w:rPr>
+              <w:t xml:space="preserve">{impactSystem}</w:t>
             </w:r>
           </w:p>
           <w:p>
@@ -1315,18 +1356,25 @@
               <w:spacing w:before="60" w:line="276" w:lineRule="auto"/>
               <w:jc w:val="left"/>
               <w:rPr>
-                <w:bCs/>
+                <w:b/>
                 <w:sz w:val="24"/>
                 <w:szCs w:val="24"/>
               </w:rPr>
             </w:pPr>
             <w:r>
               <w:rPr>
-                <w:bCs/>
-                <w:sz w:val="24"/>
-                <w:szCs w:val="24"/>
-              </w:rPr>
-              <w:t xml:space="preserve">Document: {impactDocument}</w:t>
+                <w:b/>
+                <w:sz w:val="24"/>
+                <w:szCs w:val="24"/>
+              </w:rPr>
+              <w:t xml:space="preserve">Document: </w:t>
+            </w:r>
+            <w:r>
+              <w:rPr>
+                <w:sz w:val="24"/>
+                <w:szCs w:val="24"/>
+              </w:rPr>
+              <w:t xml:space="preserve">{impactDocument}</w:t>
             </w:r>
           </w:p>
           <w:p>
@@ -1334,18 +1382,25 @@
               <w:spacing w:before="60" w:line="276" w:lineRule="auto"/>
               <w:jc w:val="left"/>
               <w:rPr>
-                <w:bCs/>
+                <w:b/>
                 <w:sz w:val="24"/>
                 <w:szCs w:val="24"/>
               </w:rPr>
             </w:pPr>
             <w:r>
               <w:rPr>
-                <w:bCs/>
-                <w:sz w:val="24"/>
-                <w:szCs w:val="24"/>
-              </w:rPr>
-              <w:t xml:space="preserve">Product: {impactProduct}</w:t>
+                <w:b/>
+                <w:sz w:val="24"/>
+                <w:szCs w:val="24"/>
+              </w:rPr>
+              <w:t xml:space="preserve">Product: </w:t>
+            </w:r>
+            <w:r>
+              <w:rPr>
+                <w:sz w:val="24"/>
+                <w:szCs w:val="24"/>
+              </w:rPr>
+              <w:t xml:space="preserve">{impactProduct}</w:t>
             </w:r>
           </w:p>
           <w:p>
@@ -1353,18 +1408,25 @@
               <w:spacing w:before="60" w:line="276" w:lineRule="auto"/>
               <w:jc w:val="left"/>
               <w:rPr>
-                <w:bCs/>
+                <w:b/>
                 <w:sz w:val="24"/>
                 <w:szCs w:val="24"/>
               </w:rPr>
             </w:pPr>
             <w:r>
               <w:rPr>
-                <w:bCs/>
-                <w:sz w:val="24"/>
-                <w:szCs w:val="24"/>
-              </w:rPr>
-              <w:t xml:space="preserve">Equipment: {impactEquipment}</w:t>
+                <w:b/>
+                <w:sz w:val="24"/>
+                <w:szCs w:val="24"/>
+              </w:rPr>
+              <w:t xml:space="preserve">Equipment: </w:t>
+            </w:r>
+            <w:r>
+              <w:rPr>
+                <w:sz w:val="24"/>
+                <w:szCs w:val="24"/>
+              </w:rPr>
+              <w:t xml:space="preserve">{impactEquipment}</w:t>
             </w:r>
           </w:p>
           <w:p>
@@ -1372,18 +1434,25 @@
               <w:spacing w:before="60" w:line="276" w:lineRule="auto"/>
               <w:jc w:val="left"/>
               <w:rPr>
-                <w:bCs/>
+                <w:b/>
                 <w:sz w:val="24"/>
                 <w:szCs w:val="24"/>
               </w:rPr>
             </w:pPr>
             <w:r>
               <w:rPr>
-                <w:bCs/>
-                <w:sz w:val="24"/>
-                <w:szCs w:val="24"/>
-              </w:rPr>
-              <w:t xml:space="preserve">Patient safety / Past Batches: {impactPatientSafety}</w:t>
+                <w:b/>
+                <w:sz w:val="24"/>
+                <w:szCs w:val="24"/>
+              </w:rPr>
+              <w:t xml:space="preserve">Patient safety / Past Batches: </w:t>
+            </w:r>
+            <w:r>
+              <w:rPr>
+                <w:sz w:val="24"/>
+                <w:szCs w:val="24"/>
+              </w:rPr>
+              <w:t xml:space="preserve">{impactPatientSafety}</w:t>
             </w:r>
           </w:p>
         </w:tc>
@@ -1410,18 +1479,35 @@
               <w:spacing w:before="60" w:line="276" w:lineRule="auto"/>
               <w:jc w:val="left"/>
               <w:rPr>
-                <w:bCs/>
+                <w:b/>
                 <w:sz w:val="24"/>
                 <w:szCs w:val="24"/>
               </w:rPr>
             </w:pPr>
             <w:r>
               <w:rPr>
-                <w:bCs/>
+                <w:b/>
                 <w:sz w:val="24"/>
                 <w:szCs w:val="24"/>
               </w:rPr>
               <w:t xml:space="preserve">Improve:</w:t>
+            </w:r>
+          </w:p>
+          <w:p>
+            <w:pPr>
+              <w:spacing w:before="60" w:line="276" w:lineRule="auto"/>
+              <w:jc w:val="left"/>
+              <w:rPr>
+                <w:sz w:val="24"/>
+                <w:szCs w:val="24"/>
+              </w:rPr>
+            </w:pPr>
+            <w:r>
+              <w:rPr>
+                <w:sz w:val="24"/>
+                <w:szCs w:val="24"/>
+              </w:rPr>
+              <w:t xml:space="preserve">{@improveNarrativeXml}</w:t>
             </w:r>
           </w:p>
         </w:tc>
@@ -1483,14 +1569,12 @@
               <w:spacing w:before="60" w:line="276" w:lineRule="auto"/>
               <w:jc w:val="left"/>
               <w:rPr>
-                <w:bCs/>
                 <w:sz w:val="24"/>
                 <w:szCs w:val="24"/>
               </w:rPr>
             </w:pPr>
             <w:r>
               <w:rPr>
-                <w:bCs/>
                 <w:sz w:val="24"/>
                 <w:szCs w:val="24"/>
               </w:rPr>
@@ -1520,18 +1604,35 @@
               <w:spacing w:before="60" w:line="276" w:lineRule="auto"/>
               <w:jc w:val="left"/>
               <w:rPr>
-                <w:bCs/>
+                <w:b/>
                 <w:sz w:val="24"/>
                 <w:szCs w:val="24"/>
               </w:rPr>
             </w:pPr>
             <w:r>
               <w:rPr>
-                <w:bCs/>
+                <w:b/>
                 <w:sz w:val="24"/>
                 <w:szCs w:val="24"/>
               </w:rPr>
               <w:t xml:space="preserve">Control:</w:t>
+            </w:r>
+          </w:p>
+          <w:p>
+            <w:pPr>
+              <w:spacing w:before="60" w:line="276" w:lineRule="auto"/>
+              <w:jc w:val="left"/>
+              <w:rPr>
+                <w:sz w:val="24"/>
+                <w:szCs w:val="24"/>
+              </w:rPr>
+            </w:pPr>
+            <w:r>
+              <w:rPr>
+                <w:sz w:val="24"/>
+                <w:szCs w:val="24"/>
+              </w:rPr>
+              <w:t xml:space="preserve">{@controlNarrativeXml}</w:t>
             </w:r>
           </w:p>
         </w:tc>
@@ -1593,14 +1694,12 @@
               <w:spacing w:before="60" w:line="276" w:lineRule="auto"/>
               <w:jc w:val="left"/>
               <w:rPr>
-                <w:bCs/>
                 <w:sz w:val="24"/>
                 <w:szCs w:val="24"/>
               </w:rPr>
             </w:pPr>
             <w:r>
               <w:rPr>
-                <w:bCs/>
                 <w:sz w:val="24"/>
                 <w:szCs w:val="24"/>
               </w:rPr>
@@ -1688,14 +1787,12 @@
               <w:spacing w:before="60" w:line="276" w:lineRule="auto"/>
               <w:jc w:val="left"/>
               <w:rPr>
-                <w:bCs/>
                 <w:sz w:val="24"/>
                 <w:szCs w:val="24"/>
               </w:rPr>
             </w:pPr>
             <w:r>
               <w:rPr>
-                <w:bCs/>
                 <w:sz w:val="24"/>
                 <w:szCs w:val="24"/>
               </w:rPr>
@@ -1761,14 +1858,12 @@
               <w:spacing w:before="60" w:line="276" w:lineRule="auto"/>
               <w:jc w:val="left"/>
               <w:rPr>
-                <w:bCs/>
                 <w:sz w:val="24"/>
                 <w:szCs w:val="24"/>
               </w:rPr>
             </w:pPr>
             <w:r>
               <w:rPr>
-                <w:bCs/>
                 <w:sz w:val="24"/>
                 <w:szCs w:val="24"/>
               </w:rPr>
@@ -1780,14 +1875,12 @@
               <w:spacing w:before="60" w:line="276" w:lineRule="auto"/>
               <w:jc w:val="left"/>
               <w:rPr>
-                <w:bCs/>
                 <w:sz w:val="24"/>
                 <w:szCs w:val="24"/>
               </w:rPr>
             </w:pPr>
             <w:r>
               <w:rPr>
-                <w:bCs/>
                 <w:sz w:val="24"/>
                 <w:szCs w:val="24"/>
               </w:rPr>
@@ -1799,14 +1892,12 @@
               <w:spacing w:before="60" w:line="276" w:lineRule="auto"/>
               <w:jc w:val="left"/>
               <w:rPr>
-                <w:bCs/>
                 <w:sz w:val="24"/>
                 <w:szCs w:val="24"/>
               </w:rPr>
             </w:pPr>
             <w:r>
               <w:rPr>
-                <w:bCs/>
                 <w:sz w:val="24"/>
                 <w:szCs w:val="24"/>
               </w:rPr>

</xml_diff>

<commit_message>
fxing parsing of analyse section
</commit_message>
<xml_diff>
--- a/templates/investigation-report-template.docx
+++ b/templates/investigation-report-template.docx
@@ -1332,129 +1332,16 @@
               <w:spacing w:before="60" w:line="276" w:lineRule="auto"/>
               <w:jc w:val="left"/>
               <w:rPr>
-                <w:b/>
                 <w:sz w:val="24"/>
                 <w:szCs w:val="24"/>
               </w:rPr>
             </w:pPr>
             <w:r>
               <w:rPr>
-                <w:b/>
-                <w:sz w:val="24"/>
-                <w:szCs w:val="24"/>
-              </w:rPr>
-              <w:t xml:space="preserve">System: </w:t>
-            </w:r>
-            <w:r>
-              <w:rPr>
-                <w:sz w:val="24"/>
-                <w:szCs w:val="24"/>
-              </w:rPr>
-              <w:t xml:space="preserve">{impactSystem}</w:t>
-            </w:r>
-          </w:p>
-          <w:p>
-            <w:pPr>
-              <w:spacing w:before="60" w:line="276" w:lineRule="auto"/>
-              <w:jc w:val="left"/>
-              <w:rPr>
-                <w:b/>
-                <w:sz w:val="24"/>
-                <w:szCs w:val="24"/>
-              </w:rPr>
-            </w:pPr>
-            <w:r>
-              <w:rPr>
-                <w:b/>
-                <w:sz w:val="24"/>
-                <w:szCs w:val="24"/>
-              </w:rPr>
-              <w:t xml:space="preserve">Document: </w:t>
-            </w:r>
-            <w:r>
-              <w:rPr>
-                <w:sz w:val="24"/>
-                <w:szCs w:val="24"/>
-              </w:rPr>
-              <w:t xml:space="preserve">{impactDocument}</w:t>
-            </w:r>
-          </w:p>
-          <w:p>
-            <w:pPr>
-              <w:spacing w:before="60" w:line="276" w:lineRule="auto"/>
-              <w:jc w:val="left"/>
-              <w:rPr>
-                <w:b/>
-                <w:sz w:val="24"/>
-                <w:szCs w:val="24"/>
-              </w:rPr>
-            </w:pPr>
-            <w:r>
-              <w:rPr>
-                <w:b/>
-                <w:sz w:val="24"/>
-                <w:szCs w:val="24"/>
-              </w:rPr>
-              <w:t xml:space="preserve">Product: </w:t>
-            </w:r>
-            <w:r>
-              <w:rPr>
-                <w:sz w:val="24"/>
-                <w:szCs w:val="24"/>
-              </w:rPr>
-              <w:t xml:space="preserve">{impactProduct}</w:t>
-            </w:r>
-          </w:p>
-          <w:p>
-            <w:pPr>
-              <w:spacing w:before="60" w:line="276" w:lineRule="auto"/>
-              <w:jc w:val="left"/>
-              <w:rPr>
-                <w:b/>
-                <w:sz w:val="24"/>
-                <w:szCs w:val="24"/>
-              </w:rPr>
-            </w:pPr>
-            <w:r>
-              <w:rPr>
-                <w:b/>
-                <w:sz w:val="24"/>
-                <w:szCs w:val="24"/>
-              </w:rPr>
-              <w:t xml:space="preserve">Equipment: </w:t>
-            </w:r>
-            <w:r>
-              <w:rPr>
-                <w:sz w:val="24"/>
-                <w:szCs w:val="24"/>
-              </w:rPr>
-              <w:t xml:space="preserve">{impactEquipment}</w:t>
-            </w:r>
-          </w:p>
-          <w:p>
-            <w:pPr>
-              <w:spacing w:before="60" w:line="276" w:lineRule="auto"/>
-              <w:jc w:val="left"/>
-              <w:rPr>
-                <w:b/>
-                <w:sz w:val="24"/>
-                <w:szCs w:val="24"/>
-              </w:rPr>
-            </w:pPr>
-            <w:r>
-              <w:rPr>
-                <w:b/>
-                <w:sz w:val="24"/>
-                <w:szCs w:val="24"/>
-              </w:rPr>
-              <w:t xml:space="preserve">Patient safety / Past Batches: </w:t>
-            </w:r>
-            <w:r>
-              <w:rPr>
-                <w:sz w:val="24"/>
-                <w:szCs w:val="24"/>
-              </w:rPr>
-              <w:t xml:space="preserve">{impactPatientSafety}</w:t>
+                <w:sz w:val="24"/>
+                <w:szCs w:val="24"/>
+              </w:rPr>
+              <w:t xml:space="preserve">{@impactAssessmentXml}</w:t>
             </w:r>
           </w:p>
         </w:tc>

</xml_diff>

<commit_message>
Use Word heading styles for MJ and demo DOCX tables of contents
Remove the baked-in TABLE OF CONTENTS tables from the MJ QRA and ELR
templates. Mark section titles Heading1–3 on investigation, QRA, ELR, and
Convergent DV exports so Word Insert → Table of Contents works the same way
across packs.

Co-authored-by: sachin.agrawal272 <sachin.agrawal272@gmail.com>
</commit_message>
<xml_diff>
--- a/templates/investigation-report-template.docx
+++ b/templates/investigation-report-template.docx
@@ -620,7 +620,20 @@
                 <w:sz w:val="24"/>
                 <w:szCs w:val="24"/>
               </w:rPr>
-              <w:t>Analyze: Various investigation tools used to analyze the root cause like 6M, 5 Why, Personnel interview, Brainstorming etc.</w:t>
+              <w:t>Analyze:</w:t>
+            </w:r>
+          </w:p>
+          <w:p>
+            <w:pPr>
+              <w:spacing w:before="60" w:line="276" w:lineRule="auto"/>
+              <w:jc w:val="both"/>
+            </w:pPr>
+            <w:r>
+              <w:rPr>
+                <w:sz w:val="20"/>
+                <w:szCs w:val="20"/>
+              </w:rPr>
+              <w:t xml:space="preserve">Various investigation tools used to analyze the root cause like 6M, 5 Why, Personnel interview, Brainstorming etc.</w:t>
             </w:r>
           </w:p>
         </w:tc>

</xml_diff>